<commit_message>
docs(lomba): nomor Surat Sekda, Sekda baru, dan pindaian Lampiran 6
- Surat Sekda kini bernomor 300.2.10/265/SETDA/2026 dan bertanggal
  12 Maret 2026 sesuai surat yang ditandatangani; naskah sebelumnya
  menulis 11 Maret (tanggal konsep) di tujuh tempat.
- Koreksi dari berkas Word ketua tim: kontak, NIP, tanggal pakta.
- Surat usulan: kop resmi Setda dan penanda tangan Sekretaris Daerah
  Abd. Azis Hasan, A.P., M.H., CGCAE. (pejabat sebelumnya telah pensiun).
- Lampiran 6: pindaian SK Tim Koordinasi dan Surat Sekda disisipkan.
  gabung.py kini menerima beberapa sisipan per lampiran.
- Bagian 11.4 menyebut tembusan surat kepada Wali Kota dan Kepala
  Bappeda Litbang, sesuai yang tercantum pada surat.

Co-Authored-By: Claude Opus 5.5 <noreply@anthropic.com>
Claude-Session: https://claude.ai/code/session_01TchDZWsQsgeuq52sKmozd1
</commit_message>
<xml_diff>
--- a/docs/lomba/Proposal-Prokopim-Hibot.docx
+++ b/docs/lomba/Proposal-Prokopim-Hibot.docx
@@ -1762,25 +1762,7 @@
           <w:sz w:val="22"/>
           <w:szCs w:val="22"/>
         </w:rPr>
-        <w:t xml:space="preserve"> Aplikasi mulai digunakan pada Maret 2026. Kegiatan pertama tercatat pada 9 Maret 2026, dan penggunaannya dikuatkan Surat Sekretaris Daerah Kota Tarakan Nomor 300.2.10/</w:t>
-      </w:r>
-      <w:r>
-        <w:rPr>
-          <w:rFonts w:ascii="Arial" w:cs="Arial" w:eastAsia="Arial" w:hAnsi="Arial"/>
-          <w:sz w:val="22"/>
-          <w:szCs w:val="22"/>
-          <w:highlight w:val="yellow"/>
-          <w:highlightCs w:val="yellow"/>
-        </w:rPr>
-        <w:t xml:space="preserve">XXX</w:t>
-      </w:r>
-      <w:r>
-        <w:rPr>
-          <w:rFonts w:ascii="Arial" w:cs="Arial" w:eastAsia="Arial" w:hAnsi="Arial"/>
-          <w:sz w:val="22"/>
-          <w:szCs w:val="22"/>
-        </w:rPr>
-        <w:t xml:space="preserve">/SETDA/2026 tanggal 11 Maret 2026. Pada saat pendaftaran ditutup, inovasi ini telah berjalan 6 bulan 21 hari. Pelaksanaannya didukung Keputusan Sekretaris Daerah Kota Tarakan Nomor 100.3.3.6/98/HK/VIII/2026 dan sebelas standar operasional prosedur (SOP).</w:t>
+        <w:t xml:space="preserve"> Aplikasi mulai digunakan pada Maret 2026. Kegiatan pertama tercatat pada 9 Maret 2026, dan penggunaannya dikuatkan Surat Sekretaris Daerah Kota Tarakan Nomor 300.2.10/265/SETDA/2026 tanggal 12 Maret 2026. Pada saat pendaftaran ditutup, inovasi ini telah berjalan 6 bulan 21 hari. Pelaksanaannya didukung Keputusan Sekretaris Daerah Kota Tarakan Nomor 100.3.3.6/98/HK/VIII/2026 dan sebelas standar operasional prosedur (SOP).</w:t>
       </w:r>
     </w:p>
     <w:p>
@@ -3555,43 +3537,7 @@
           <w:sz w:val="22"/>
           <w:szCs w:val="22"/>
         </w:rPr>
-        <w:t xml:space="preserve"> telepon </w:t>
-      </w:r>
-      <w:r>
-        <w:rPr>
-          <w:rFonts w:ascii="Arial" w:cs="Arial" w:eastAsia="Arial" w:hAnsi="Arial"/>
-          <w:sz w:val="22"/>
-          <w:szCs w:val="22"/>
-          <w:highlight w:val="yellow"/>
-          <w:highlightCs w:val="yellow"/>
-        </w:rPr>
-        <w:t xml:space="preserve">nomor telepon</w:t>
-      </w:r>
-      <w:r>
-        <w:rPr>
-          <w:rFonts w:ascii="Arial" w:cs="Arial" w:eastAsia="Arial" w:hAnsi="Arial"/>
-          <w:sz w:val="22"/>
-          <w:szCs w:val="22"/>
-        </w:rPr>
-        <w:t xml:space="preserve">; surel </w:t>
-      </w:r>
-      <w:r>
-        <w:rPr>
-          <w:rFonts w:ascii="Arial" w:cs="Arial" w:eastAsia="Arial" w:hAnsi="Arial"/>
-          <w:sz w:val="22"/>
-          <w:szCs w:val="22"/>
-          <w:highlight w:val="yellow"/>
-          <w:highlightCs w:val="yellow"/>
-        </w:rPr>
-        <w:t xml:space="preserve">alamat surel</w:t>
-      </w:r>
-      <w:r>
-        <w:rPr>
-          <w:rFonts w:ascii="Arial" w:cs="Arial" w:eastAsia="Arial" w:hAnsi="Arial"/>
-          <w:sz w:val="22"/>
-          <w:szCs w:val="22"/>
-        </w:rPr>
-        <w:t xml:space="preserve">.</w:t>
+        <w:t xml:space="preserve"> ponsel/WhatsApp 0811-5900-394; surel anugrahyegapranatha@gmail.com.</w:t>
       </w:r>
     </w:p>
     <w:p>
@@ -6483,25 +6429,7 @@
           <w:sz w:val="22"/>
           <w:szCs w:val="22"/>
         </w:rPr>
-        <w:t xml:space="preserve">Surat Sekretaris Daerah Kota Tarakan Nomor 300.2.10/</w:t>
-      </w:r>
-      <w:r>
-        <w:rPr>
-          <w:rFonts w:ascii="Arial" w:cs="Arial" w:eastAsia="Arial" w:hAnsi="Arial"/>
-          <w:sz w:val="22"/>
-          <w:szCs w:val="22"/>
-          <w:highlight w:val="yellow"/>
-          <w:highlightCs w:val="yellow"/>
-        </w:rPr>
-        <w:t xml:space="preserve">XXX</w:t>
-      </w:r>
-      <w:r>
-        <w:rPr>
-          <w:rFonts w:ascii="Arial" w:cs="Arial" w:eastAsia="Arial" w:hAnsi="Arial"/>
-          <w:sz w:val="22"/>
-          <w:szCs w:val="22"/>
-        </w:rPr>
-        <w:t xml:space="preserve">/SETDA/2026 tanggal 11 Maret 2026 perihal Permohonan Subdomain.</w:t>
+        <w:t xml:space="preserve">Surat Sekretaris Daerah Kota Tarakan Nomor 300.2.10/265/SETDA/2026 tanggal 12 Maret 2026 perihal Permohonan Subdomain.</w:t>
       </w:r>
     </w:p>
     <w:p>
@@ -10120,25 +10048,7 @@
                 <w:sz w:val="20"/>
                 <w:szCs w:val="20"/>
               </w:rPr>
-              <w:t xml:space="preserve">Surat Sekda Nomor 300.2.10/</w:t>
-            </w:r>
-            <w:r>
-              <w:rPr>
-                <w:rFonts w:ascii="Arial" w:cs="Arial" w:eastAsia="Arial" w:hAnsi="Arial"/>
-                <w:sz w:val="20"/>
-                <w:szCs w:val="20"/>
-                <w:highlight w:val="yellow"/>
-                <w:highlightCs w:val="yellow"/>
-              </w:rPr>
-              <w:t xml:space="preserve">XXX</w:t>
-            </w:r>
-            <w:r>
-              <w:rPr>
-                <w:rFonts w:ascii="Arial" w:cs="Arial" w:eastAsia="Arial" w:hAnsi="Arial"/>
-                <w:sz w:val="20"/>
-                <w:szCs w:val="20"/>
-              </w:rPr>
-              <w:t xml:space="preserve">/SETDA/2026 tanggal 11 Maret 2026, yang menyatakan sistem telah dikembangkan dan memohon subdomain prokopim.tarakankota.go.id</w:t>
+              <w:t xml:space="preserve">Surat Sekda Nomor 300.2.10/265/SETDA/2026 tanggal 12 Maret 2026, yang menyatakan sistem telah dikembangkan dan memohon subdomain prokopim.tarakankota.go.id</w:t>
             </w:r>
           </w:p>
         </w:tc>
@@ -11928,7 +11838,7 @@
           <w:sz w:val="22"/>
           <w:szCs w:val="22"/>
         </w:rPr>
-        <w:t xml:space="preserve">Keputusan pendukung berupa Keputusan Sekretaris Daerah Nomor 100.3.3.6/98/HK/VIII/2026 dan Surat Sekretaris Daerah tanggal 11 Maret 2026 (Lampiran 6). Dokumentasi berupa tangkapan layar setiap alur dan video demonstrasi disertakan pada Lampiran 4 dan Lampiran 5.</w:t>
+        <w:t xml:space="preserve">Keputusan pendukung berupa Keputusan Sekretaris Daerah Nomor 100.3.3.6/98/HK/VIII/2026 dan Surat Sekretaris Daerah tanggal 12 Maret 2026 (Lampiran 6). Dokumentasi berupa tangkapan layar setiap alur dan video demonstrasi disertakan pada Lampiran 4 dan Lampiran 5.</w:t>
       </w:r>
     </w:p>
     <w:p>
@@ -16660,7 +16570,7 @@
                 <w:sz w:val="20"/>
                 <w:szCs w:val="20"/>
               </w:rPr>
-              <w:t xml:space="preserve">Keputusan Sekda tentang Tim Koordinasi; Surat Sekda tanggal 11 Maret 2026; Surat Edaran Wali Kota tentang Inovasi Daerah</w:t>
+              <w:t xml:space="preserve">Keputusan Sekda tentang Tim Koordinasi; Surat Sekda tanggal 12 Maret 2026; Surat Edaran Wali Kota tentang Inovasi Daerah</w:t>
             </w:r>
           </w:p>
         </w:tc>
@@ -18145,7 +18055,7 @@
           <w:sz w:val="22"/>
           <w:szCs w:val="22"/>
         </w:rPr>
-        <w:t xml:space="preserve">Koordinasi dengan perangkat daerah teknis.</w:t>
+        <w:t xml:space="preserve">Pemberitahuan resmi.</w:t>
       </w:r>
       <w:r>
         <w:rPr>
@@ -18153,7 +18063,7 @@
           <w:sz w:val="22"/>
           <w:szCs w:val="22"/>
         </w:rPr>
-        <w:t xml:space="preserve"> Dinas Komunikasi, Informatika, Statistik dan Persandian serta Bappeda Litbang telah menerima pemberitahuan resmi melalui Surat Sekretaris Daerah tanggal 11 Maret 2026.</w:t>
+        <w:t xml:space="preserve"> Melalui Surat Sekretaris Daerah Nomor 300.2.10/265/SETDA/2026 tanggal 12 Maret 2026, Dinas Komunikasi, Informatika, Statistik dan Persandian dimohonkan memfasilitasi subdomain, dengan tembusan kepada Wali Kota Tarakan dan Kepala Bappeda Litbang.</w:t>
       </w:r>
     </w:p>
     <w:p>
@@ -19111,25 +19021,7 @@
                 <w:sz w:val="20"/>
                 <w:szCs w:val="20"/>
               </w:rPr>
-              <w:t xml:space="preserve">Dokumen keputusan: (a) Keputusan Sekretaris Daerah Nomor 100.3.3.6/98/HK/VIII/2026; (b) Surat Sekretaris Daerah Nomor 300.2.10/</w:t>
-            </w:r>
-            <w:r>
-              <w:rPr>
-                <w:rFonts w:ascii="Arial" w:cs="Arial" w:eastAsia="Arial" w:hAnsi="Arial"/>
-                <w:sz w:val="20"/>
-                <w:szCs w:val="20"/>
-                <w:highlight w:val="yellow"/>
-                <w:highlightCs w:val="yellow"/>
-              </w:rPr>
-              <w:t xml:space="preserve">XXX</w:t>
-            </w:r>
-            <w:r>
-              <w:rPr>
-                <w:rFonts w:ascii="Arial" w:cs="Arial" w:eastAsia="Arial" w:hAnsi="Arial"/>
-                <w:sz w:val="20"/>
-                <w:szCs w:val="20"/>
-              </w:rPr>
-              <w:t xml:space="preserve">/SETDA/2026</w:t>
+              <w:t xml:space="preserve">Dokumen keputusan: (a) Keputusan Sekretaris Daerah Nomor 100.3.3.6/98/HK/VIII/2026; (b) Surat Sekretaris Daerah Nomor 300.2.10/265/SETDA/2026</w:t>
             </w:r>
           </w:p>
         </w:tc>
@@ -19678,10 +19570,8 @@
                 <w:rFonts w:ascii="Arial" w:cs="Arial" w:eastAsia="Arial" w:hAnsi="Arial"/>
                 <w:sz w:val="22"/>
                 <w:szCs w:val="22"/>
-                <w:highlight w:val="yellow"/>
-                <w:highlightCs w:val="yellow"/>
-              </w:rPr>
-              <w:t xml:space="preserve">NIP</w:t>
+              </w:rPr>
+              <w:t xml:space="preserve">19881103 200701 1 003</w:t>
             </w:r>
           </w:p>
         </w:tc>
@@ -20216,8 +20106,34 @@
                 <w:sz w:val="22"/>
                 <w:szCs w:val="22"/>
               </w:rPr>
-              <w:t xml:space="preserve">Tarakan, </w:t>
-            </w:r>
+              <w:t xml:space="preserve">Tarakan, 24 September 2026</w:t>
+            </w:r>
+          </w:p>
+          <w:p>
+            <w:pPr>
+              <w:spacing w:after="0" w:line="240" w:lineRule="auto"/>
+              <w:jc w:val="left"/>
+            </w:pPr>
+            <w:r>
+              <w:rPr>
+                <w:rFonts w:ascii="Arial" w:cs="Arial" w:eastAsia="Arial" w:hAnsi="Arial"/>
+                <w:sz w:val="22"/>
+                <w:szCs w:val="22"/>
+              </w:rPr>
+              <w:t xml:space="preserve">Yang membuat pernyataan,</w:t>
+            </w:r>
+          </w:p>
+          <w:p>
+            <w:pPr>
+              <w:spacing w:after="0" w:line="240" w:lineRule="auto"/>
+              <w:jc w:val="left"/>
+            </w:pPr>
+          </w:p>
+          <w:p>
+            <w:pPr>
+              <w:spacing w:after="0" w:line="240" w:lineRule="auto"/>
+              <w:jc w:val="left"/>
+            </w:pPr>
             <w:r>
               <w:rPr>
                 <w:rFonts w:ascii="Arial" w:cs="Arial" w:eastAsia="Arial" w:hAnsi="Arial"/>
@@ -20226,50 +20142,6 @@
                 <w:highlight w:val="yellow"/>
                 <w:highlightCs w:val="yellow"/>
               </w:rPr>
-              <w:t xml:space="preserve">tanggal</w:t>
-            </w:r>
-            <w:r>
-              <w:rPr>
-                <w:rFonts w:ascii="Arial" w:cs="Arial" w:eastAsia="Arial" w:hAnsi="Arial"/>
-                <w:sz w:val="22"/>
-                <w:szCs w:val="22"/>
-              </w:rPr>
-              <w:t xml:space="preserve"> September 2026</w:t>
-            </w:r>
-          </w:p>
-          <w:p>
-            <w:pPr>
-              <w:spacing w:after="0" w:line="240" w:lineRule="auto"/>
-              <w:jc w:val="left"/>
-            </w:pPr>
-            <w:r>
-              <w:rPr>
-                <w:rFonts w:ascii="Arial" w:cs="Arial" w:eastAsia="Arial" w:hAnsi="Arial"/>
-                <w:sz w:val="22"/>
-                <w:szCs w:val="22"/>
-              </w:rPr>
-              <w:t xml:space="preserve">Yang membuat pernyataan,</w:t>
-            </w:r>
-          </w:p>
-          <w:p>
-            <w:pPr>
-              <w:spacing w:after="0" w:line="240" w:lineRule="auto"/>
-              <w:jc w:val="left"/>
-            </w:pPr>
-          </w:p>
-          <w:p>
-            <w:pPr>
-              <w:spacing w:after="0" w:line="240" w:lineRule="auto"/>
-              <w:jc w:val="left"/>
-            </w:pPr>
-            <w:r>
-              <w:rPr>
-                <w:rFonts w:ascii="Arial" w:cs="Arial" w:eastAsia="Arial" w:hAnsi="Arial"/>
-                <w:sz w:val="22"/>
-                <w:szCs w:val="22"/>
-                <w:highlight w:val="yellow"/>
-                <w:highlightCs w:val="yellow"/>
-              </w:rPr>
               <w:t xml:space="preserve">meterai Rp10.000</w:t>
             </w:r>
           </w:p>
@@ -20306,17 +20178,7 @@
                 <w:sz w:val="22"/>
                 <w:szCs w:val="22"/>
               </w:rPr>
-              <w:t xml:space="preserve">NIP </w:t>
-            </w:r>
-            <w:r>
-              <w:rPr>
-                <w:rFonts w:ascii="Arial" w:cs="Arial" w:eastAsia="Arial" w:hAnsi="Arial"/>
-                <w:sz w:val="22"/>
-                <w:szCs w:val="22"/>
-                <w:highlight w:val="yellow"/>
-                <w:highlightCs w:val="yellow"/>
-              </w:rPr>
-              <w:t xml:space="preserve">NIP</w:t>
+              <w:t xml:space="preserve">NIP 19881103 200701 1 003</w:t>
             </w:r>
           </w:p>
         </w:tc>
@@ -20443,8 +20305,8 @@
                 <w:rFonts w:ascii="Arial" w:cs="Arial" w:eastAsia="Arial" w:hAnsi="Arial"/>
                 <w:b/>
                 <w:bCs/>
-                <w:sz w:val="24"/>
-                <w:szCs w:val="24"/>
+                <w:sz w:val="22"/>
+                <w:szCs w:val="22"/>
               </w:rPr>
               <w:t xml:space="preserve">PEMERINTAH KOTA TARAKAN</w:t>
             </w:r>
@@ -20459,8 +20321,8 @@
                 <w:rFonts w:ascii="Arial" w:cs="Arial" w:eastAsia="Arial" w:hAnsi="Arial"/>
                 <w:b/>
                 <w:bCs/>
-                <w:sz w:val="24"/>
-                <w:szCs w:val="24"/>
+                <w:sz w:val="22"/>
+                <w:szCs w:val="22"/>
               </w:rPr>
               <w:t xml:space="preserve">SEKRETARIAT DAERAH</w:t>
             </w:r>
@@ -20473,12 +20335,10 @@
             <w:r>
               <w:rPr>
                 <w:rFonts w:ascii="Arial" w:cs="Arial" w:eastAsia="Arial" w:hAnsi="Arial"/>
-                <w:sz w:val="24"/>
-                <w:szCs w:val="24"/>
-                <w:highlight w:val="yellow"/>
-                <w:highlightCs w:val="yellow"/>
-              </w:rPr>
-              <w:t xml:space="preserve">alamat kantor, telepon, laman</w:t>
+                <w:sz w:val="22"/>
+                <w:szCs w:val="22"/>
+              </w:rPr>
+              <w:t xml:space="preserve">Jalan Pulau Kalimantan No. 1 Kota Tarakan 77113</w:t>
             </w:r>
           </w:p>
           <w:p>
@@ -20489,12 +20349,24 @@
             <w:r>
               <w:rPr>
                 <w:rFonts w:ascii="Arial" w:cs="Arial" w:eastAsia="Arial" w:hAnsi="Arial"/>
-                <w:b/>
-                <w:bCs/>
-                <w:sz w:val="24"/>
-                <w:szCs w:val="24"/>
-              </w:rPr>
-              <w:t xml:space="preserve">TARAKAN</w:t>
+                <w:sz w:val="22"/>
+                <w:szCs w:val="22"/>
+              </w:rPr>
+              <w:t xml:space="preserve">Telp (0551) 21620, 21623 Fax (0551) 33846</w:t>
+            </w:r>
+          </w:p>
+          <w:p>
+            <w:pPr>
+              <w:spacing w:after="0" w:line="240" w:lineRule="auto"/>
+              <w:jc w:val="center"/>
+            </w:pPr>
+            <w:r>
+              <w:rPr>
+                <w:rFonts w:ascii="Arial" w:cs="Arial" w:eastAsia="Arial" w:hAnsi="Arial"/>
+                <w:sz w:val="22"/>
+                <w:szCs w:val="22"/>
+              </w:rPr>
+              <w:t xml:space="preserve">Laman: www.tarakankota.go.id Pos-el: setda@tarakankota.go.id</w:t>
             </w:r>
           </w:p>
         </w:tc>
@@ -21739,12 +21611,12 @@
             <w:r>
               <w:rPr>
                 <w:rFonts w:ascii="Arial" w:cs="Arial" w:eastAsia="Arial" w:hAnsi="Arial"/>
+                <w:b/>
+                <w:bCs/>
                 <w:sz w:val="22"/>
                 <w:szCs w:val="22"/>
-                <w:highlight w:val="yellow"/>
-                <w:highlightCs w:val="yellow"/>
-              </w:rPr>
-              <w:t xml:space="preserve">nama Sekretaris Daerah</w:t>
+              </w:rPr>
+              <w:t xml:space="preserve">ABD. AZIS HASAN, A.P., M.H., CGCAE.</w:t>
             </w:r>
           </w:p>
           <w:p>
@@ -21757,10 +21629,8 @@
                 <w:rFonts w:ascii="Arial" w:cs="Arial" w:eastAsia="Arial" w:hAnsi="Arial"/>
                 <w:sz w:val="22"/>
                 <w:szCs w:val="22"/>
-                <w:highlight w:val="yellow"/>
-                <w:highlightCs w:val="yellow"/>
-              </w:rPr>
-              <w:t xml:space="preserve">pangkat/golongan</w:t>
+              </w:rPr>
+              <w:t xml:space="preserve">Pembina Utama Muda (IV/c)</w:t>
             </w:r>
           </w:p>
           <w:p>
@@ -21774,17 +21644,7 @@
                 <w:sz w:val="22"/>
                 <w:szCs w:val="22"/>
               </w:rPr>
-              <w:t xml:space="preserve">NIP </w:t>
-            </w:r>
-            <w:r>
-              <w:rPr>
-                <w:rFonts w:ascii="Arial" w:cs="Arial" w:eastAsia="Arial" w:hAnsi="Arial"/>
-                <w:sz w:val="22"/>
-                <w:szCs w:val="22"/>
-                <w:highlight w:val="yellow"/>
-                <w:highlightCs w:val="yellow"/>
-              </w:rPr>
-              <w:t xml:space="preserve">NIP</w:t>
+              <w:t xml:space="preserve">NIP 19750212 199501 1 001</w:t>
             </w:r>
           </w:p>
         </w:tc>
@@ -22289,18 +22149,16 @@
     </w:p>
     <w:p>
       <w:pPr>
-        <w:spacing w:after="200" w:before="3000"/>
-        <w:jc w:val="center"/>
+        <w:spacing w:after="100" w:before="0" w:line="276" w:lineRule="auto"/>
+        <w:jc w:val="both"/>
       </w:pPr>
       <w:r>
         <w:rPr>
           <w:rFonts w:ascii="Arial" w:cs="Arial" w:eastAsia="Arial" w:hAnsi="Arial"/>
           <w:sz w:val="22"/>
           <w:szCs w:val="22"/>
-          <w:highlight w:val="yellow"/>
-          <w:highlightCs w:val="yellow"/>
-        </w:rPr>
-        <w:t xml:space="preserve">Sisipkan pindaian (a) Keputusan Sekretaris Daerah Nomor 100.3.3.6/98/HK/VIII/2026 dan (b) Surat Sekretaris Daerah tanggal 11 Maret 2026 pada halaman ini</w:t>
+        </w:rPr>
+        <w:t xml:space="preserve">Halaman-halaman berikut memuat (a) Keputusan Sekretaris Daerah Kota Tarakan Nomor 100.3.3.6/98/HK/VIII/2026 tentang Tim Koordinasi Peningkatan Pelayanan Keprotokolan dan Komunikasi Pimpinan, dan (b) Surat Sekretaris Daerah Kota Tarakan Nomor 300.2.10/265/SETDA/2026 tanggal 12 Maret 2026 perihal Permohonan Subdomain.</w:t>
       </w:r>
     </w:p>
     <w:p>

</xml_diff>

<commit_message>
docs(lomba): alamat resmi aplikasi, video di tahap 7 besar, blok tanda tangan
- Alamat aplikasi https://prokopim.tarakankota.go.id pada Lampiran 10;
  subdomain disebut telah menjadi alamat resmi, dan rencana
  "pemindahan ke subdomain" dihapus dari Tabel Rencana Pengembangan.
- Lampiran 5: video diunggah pada tahap 7 besar (15–20 Oktober 2026)
  sesuai Tabel 4.1 pedoman; tidak ada lagi isian tautan kosong.
- Lampiran 3 ditandai menyusul.
- Blok tanda tangan pakta dan testimoni kini memuat jabatan penanda
  tangan di atas nama.

Co-Authored-By: Claude Opus 5.5 <noreply@anthropic.com>
Claude-Session: https://claude.ai/code/session_01TchDZWsQsgeuq52sKmozd1
</commit_message>
<xml_diff>
--- a/docs/lomba/Proposal-Prokopim-Hibot.docx
+++ b/docs/lomba/Proposal-Prokopim-Hibot.docx
@@ -12020,7 +12020,7 @@
           <w:sz w:val="22"/>
           <w:szCs w:val="22"/>
         </w:rPr>
-        <w:t xml:space="preserve"> dimohonkan memfasilitasi subdomain prokopim.tarakankota.go.id.</w:t>
+        <w:t xml:space="preserve"> memfasilitasi subdomain prokopim.tarakankota.go.id yang kini menjadi alamat resmi aplikasi.</w:t>
       </w:r>
     </w:p>
     <w:p>
@@ -16837,7 +16837,7 @@
                 <w:sz w:val="20"/>
                 <w:szCs w:val="20"/>
               </w:rPr>
-              <w:t xml:space="preserve">Pemindahan ke subdomain resmi prokopim.tarakankota.go.id; pengesahan SOP; pengalihan akun layanan ke akun resmi instansi</w:t>
+              <w:t xml:space="preserve">Pengesahan SOP; pengalihan akun layanan ke akun resmi instansi</w:t>
             </w:r>
           </w:p>
         </w:tc>
@@ -18951,7 +18951,7 @@
                 <w:sz w:val="20"/>
                 <w:szCs w:val="20"/>
               </w:rPr>
-              <w:t xml:space="preserve">Tautan video demonstrasi</w:t>
+              <w:t xml:space="preserve">Video demonstrasi (disampaikan pada tahap 7 besar)</w:t>
             </w:r>
           </w:p>
         </w:tc>
@@ -20121,6 +20121,20 @@
                 <w:szCs w:val="22"/>
               </w:rPr>
               <w:t xml:space="preserve">Yang membuat pernyataan,</w:t>
+            </w:r>
+          </w:p>
+          <w:p>
+            <w:pPr>
+              <w:spacing w:after="0" w:line="240" w:lineRule="auto"/>
+              <w:jc w:val="left"/>
+            </w:pPr>
+            <w:r>
+              <w:rPr>
+                <w:rFonts w:ascii="Arial" w:cs="Arial" w:eastAsia="Arial" w:hAnsi="Arial"/>
+                <w:sz w:val="22"/>
+                <w:szCs w:val="22"/>
+              </w:rPr>
+              <w:t xml:space="preserve">Ketua Tim Inovasi Prokopim Hibot,</w:t>
             </w:r>
           </w:p>
           <w:p>
@@ -21683,7 +21697,7 @@
           <w:highlight w:val="yellow"/>
           <w:highlightCs w:val="yellow"/>
         </w:rPr>
-        <w:t xml:space="preserve">Sisipkan pindaian KTP atau kartu pegawai kelima anggota tim pada halaman ini</w:t>
+        <w:t xml:space="preserve">Menyusul: pindaian KTP atau kartu pegawai kelima anggota tim</w:t>
       </w:r>
     </w:p>
     <w:p>
@@ -22094,12 +22108,13 @@
           <w:sz w:val="22"/>
           <w:szCs w:val="22"/>
         </w:rPr>
-        <w:t xml:space="preserve">Lampiran 5. Tautan Video Demonstrasi</w:t>
+        <w:t xml:space="preserve">Lampiran 5. Video Demonstrasi</w:t>
       </w:r>
     </w:p>
     <w:p>
       <w:pPr>
         <w:spacing w:after="100" w:before="0" w:line="276" w:lineRule="auto"/>
+        <w:ind w:firstLine="567"/>
         <w:jc w:val="both"/>
       </w:pPr>
       <w:r>
@@ -22108,23 +22123,7 @@
           <w:sz w:val="22"/>
           <w:szCs w:val="22"/>
         </w:rPr>
-        <w:t xml:space="preserve">Video demonstrasi paling lama lima menit yang memuat latar belakang inovasi, penjaringan ide, pemilihan ide, manfaat, dan dampak inovasi dapat diakses melalui tautan berikut:</w:t>
-      </w:r>
-    </w:p>
-    <w:p>
-      <w:pPr>
-        <w:spacing w:after="100" w:before="120" w:line="276" w:lineRule="auto"/>
-        <w:jc w:val="both"/>
-      </w:pPr>
-      <w:r>
-        <w:rPr>
-          <w:rFonts w:ascii="Arial" w:cs="Arial" w:eastAsia="Arial" w:hAnsi="Arial"/>
-          <w:sz w:val="22"/>
-          <w:szCs w:val="22"/>
-          <w:highlight w:val="yellow"/>
-          <w:highlightCs w:val="yellow"/>
-        </w:rPr>
-        <w:t xml:space="preserve">tautan video</w:t>
+        <w:t xml:space="preserve">Sesuai jadwal pada Panduan Teknis (Tabel 4.1), video demonstrasi paling lama lima menit yang memuat latar belakang inovasi, penjaringan ide, pemilihan ide, manfaat, dan dampak inovasi diunggah oleh peserta yang ditetapkan sebagai 7 (tujuh) besar pada 15–20 Oktober 2026. Tautan video akan disampaikan pada tahap tersebut.</w:t>
       </w:r>
     </w:p>
     <w:p>
@@ -26563,6 +26562,20 @@
               <w:spacing w:after="0" w:line="240" w:lineRule="auto"/>
               <w:jc w:val="left"/>
             </w:pPr>
+            <w:r>
+              <w:rPr>
+                <w:rFonts w:ascii="Arial" w:cs="Arial" w:eastAsia="Arial" w:hAnsi="Arial"/>
+                <w:sz w:val="22"/>
+                <w:szCs w:val="22"/>
+              </w:rPr>
+              <w:t xml:space="preserve">Wali Kota Tarakan,</w:t>
+            </w:r>
+          </w:p>
+          <w:p>
+            <w:pPr>
+              <w:spacing w:after="0" w:line="240" w:lineRule="auto"/>
+              <w:jc w:val="left"/>
+            </w:pPr>
           </w:p>
           <w:p>
             <w:pPr>
@@ -27144,6 +27157,20 @@
               <w:spacing w:after="0" w:line="240" w:lineRule="auto"/>
               <w:jc w:val="left"/>
             </w:pPr>
+            <w:r>
+              <w:rPr>
+                <w:rFonts w:ascii="Arial" w:cs="Arial" w:eastAsia="Arial" w:hAnsi="Arial"/>
+                <w:sz w:val="22"/>
+                <w:szCs w:val="22"/>
+              </w:rPr>
+              <w:t xml:space="preserve">Ajudan Wakil Wali Kota Tarakan,</w:t>
+            </w:r>
+          </w:p>
+          <w:p>
+            <w:pPr>
+              <w:spacing w:after="0" w:line="240" w:lineRule="auto"/>
+              <w:jc w:val="left"/>
+            </w:pPr>
           </w:p>
           <w:p>
             <w:pPr>
@@ -27742,6 +27769,20 @@
                 <w:szCs w:val="22"/>
               </w:rPr>
               <w:t xml:space="preserve"> September 2026</w:t>
+            </w:r>
+          </w:p>
+          <w:p>
+            <w:pPr>
+              <w:spacing w:after="0" w:line="240" w:lineRule="auto"/>
+              <w:jc w:val="left"/>
+            </w:pPr>
+            <w:r>
+              <w:rPr>
+                <w:rFonts w:ascii="Arial" w:cs="Arial" w:eastAsia="Arial" w:hAnsi="Arial"/>
+                <w:sz w:val="22"/>
+                <w:szCs w:val="22"/>
+              </w:rPr>
+              <w:t xml:space="preserve">Staf Protokol, Bagian Protokol dan Komunikasi Pimpinan,</w:t>
             </w:r>
           </w:p>
           <w:p>
@@ -27970,7 +28011,7 @@
                 <w:sz w:val="20"/>
                 <w:szCs w:val="20"/>
               </w:rPr>
-              <w:t xml:space="preserve">Permohonan audiensi</w:t>
+              <w:t xml:space="preserve">Aplikasi Prokopim Hibot</w:t>
             </w:r>
           </w:p>
         </w:tc>
@@ -28001,18 +28042,8 @@
                 <w:rFonts w:ascii="Arial" w:cs="Arial" w:eastAsia="Arial" w:hAnsi="Arial"/>
                 <w:sz w:val="20"/>
                 <w:szCs w:val="20"/>
-                <w:highlight w:val="yellow"/>
-                <w:highlightCs w:val="yellow"/>
-              </w:rPr>
-              <w:t xml:space="preserve">alamat aplikasi</w:t>
-            </w:r>
-            <w:r>
-              <w:rPr>
-                <w:rFonts w:ascii="Arial" w:cs="Arial" w:eastAsia="Arial" w:hAnsi="Arial"/>
-                <w:sz w:val="20"/>
-                <w:szCs w:val="20"/>
-              </w:rPr>
-              <w:t xml:space="preserve">/tamu</w:t>
+              </w:rPr>
+              <w:t xml:space="preserve">https://prokopim.tarakankota.go.id</w:t>
             </w:r>
           </w:p>
         </w:tc>
@@ -28050,7 +28081,7 @@
                 <w:sz w:val="20"/>
                 <w:szCs w:val="20"/>
               </w:rPr>
-              <w:t xml:space="preserve">Peminjaman ruangan</w:t>
+              <w:t xml:space="preserve">Permohonan audiensi</w:t>
             </w:r>
           </w:p>
         </w:tc>
@@ -28081,18 +28112,8 @@
                 <w:rFonts w:ascii="Arial" w:cs="Arial" w:eastAsia="Arial" w:hAnsi="Arial"/>
                 <w:sz w:val="20"/>
                 <w:szCs w:val="20"/>
-                <w:highlight w:val="yellow"/>
-                <w:highlightCs w:val="yellow"/>
-              </w:rPr>
-              <w:t xml:space="preserve">alamat aplikasi</w:t>
-            </w:r>
-            <w:r>
-              <w:rPr>
-                <w:rFonts w:ascii="Arial" w:cs="Arial" w:eastAsia="Arial" w:hAnsi="Arial"/>
-                <w:sz w:val="20"/>
-                <w:szCs w:val="20"/>
-              </w:rPr>
-              <w:t xml:space="preserve">/pinjamruangan</w:t>
+              </w:rPr>
+              <w:t xml:space="preserve">https://prokopim.tarakankota.go.id/tamu</w:t>
             </w:r>
           </w:p>
         </w:tc>
@@ -28130,7 +28151,7 @@
                 <w:sz w:val="20"/>
                 <w:szCs w:val="20"/>
               </w:rPr>
-              <w:t xml:space="preserve">Daftar hadir digital (contoh acara)</w:t>
+              <w:t xml:space="preserve">Peminjaman ruangan</w:t>
             </w:r>
           </w:p>
         </w:tc>
@@ -28161,18 +28182,78 @@
                 <w:rFonts w:ascii="Arial" w:cs="Arial" w:eastAsia="Arial" w:hAnsi="Arial"/>
                 <w:sz w:val="20"/>
                 <w:szCs w:val="20"/>
-                <w:highlight w:val="yellow"/>
-                <w:highlightCs w:val="yellow"/>
-              </w:rPr>
-              <w:t xml:space="preserve">alamat aplikasi</w:t>
-            </w:r>
-            <w:r>
-              <w:rPr>
-                <w:rFonts w:ascii="Arial" w:cs="Arial" w:eastAsia="Arial" w:hAnsi="Arial"/>
-                <w:sz w:val="20"/>
-                <w:szCs w:val="20"/>
-              </w:rPr>
-              <w:t xml:space="preserve">/daftarhadir</w:t>
+              </w:rPr>
+              <w:t xml:space="preserve">https://prokopim.tarakankota.go.id/pinjamruangan</w:t>
+            </w:r>
+          </w:p>
+        </w:tc>
+      </w:tr>
+      <w:tr>
+        <w:trPr>
+          <w:cantSplit/>
+          <w:tblHeader w:val="false"/>
+        </w:trPr>
+        <w:tc>
+          <w:tcPr>
+            <w:tcW w:type="dxa" w:w="3954"/>
+            <w:tcBorders>
+              <w:top w:val="single" w:color="000000" w:sz="4"/>
+              <w:left w:val="single" w:color="000000" w:sz="4"/>
+              <w:bottom w:val="single" w:color="000000" w:sz="4"/>
+              <w:right w:val="single" w:color="000000" w:sz="4"/>
+            </w:tcBorders>
+            <w:tcMar>
+              <w:top w:type="dxa" w:w="40"/>
+              <w:left w:type="dxa" w:w="90"/>
+              <w:bottom w:type="dxa" w:w="40"/>
+              <w:right w:type="dxa" w:w="90"/>
+            </w:tcMar>
+            <w:vAlign w:val="top"/>
+          </w:tcPr>
+          <w:p>
+            <w:pPr>
+              <w:spacing w:after="0" w:line="240" w:lineRule="auto"/>
+              <w:jc w:val="left"/>
+            </w:pPr>
+            <w:r>
+              <w:rPr>
+                <w:rFonts w:ascii="Arial" w:cs="Arial" w:eastAsia="Arial" w:hAnsi="Arial"/>
+                <w:sz w:val="20"/>
+                <w:szCs w:val="20"/>
+              </w:rPr>
+              <w:t xml:space="preserve">Daftar hadir digital</w:t>
+            </w:r>
+          </w:p>
+        </w:tc>
+        <w:tc>
+          <w:tcPr>
+            <w:tcW w:type="dxa" w:w="4833"/>
+            <w:tcBorders>
+              <w:top w:val="single" w:color="000000" w:sz="4"/>
+              <w:left w:val="single" w:color="000000" w:sz="4"/>
+              <w:bottom w:val="single" w:color="000000" w:sz="4"/>
+              <w:right w:val="single" w:color="000000" w:sz="4"/>
+            </w:tcBorders>
+            <w:tcMar>
+              <w:top w:type="dxa" w:w="40"/>
+              <w:left w:type="dxa" w:w="90"/>
+              <w:bottom w:type="dxa" w:w="40"/>
+              <w:right w:type="dxa" w:w="90"/>
+            </w:tcMar>
+            <w:vAlign w:val="top"/>
+          </w:tcPr>
+          <w:p>
+            <w:pPr>
+              <w:spacing w:after="0" w:line="240" w:lineRule="auto"/>
+              <w:jc w:val="left"/>
+            </w:pPr>
+            <w:r>
+              <w:rPr>
+                <w:rFonts w:ascii="Arial" w:cs="Arial" w:eastAsia="Arial" w:hAnsi="Arial"/>
+                <w:sz w:val="20"/>
+                <w:szCs w:val="20"/>
+              </w:rPr>
+              <w:t xml:space="preserve">https://prokopim.tarakankota.go.id/daftarhadir</w:t>
             </w:r>
           </w:p>
         </w:tc>

</xml_diff>

<commit_message>
Proposal: kalender bersama, tidak membebani APBD, akun instansi, diseminasi
- Unsur kebaruan, tabel perbandingan, tahapan, dan sumber daya memuat
  sinkron otomatis ke kalender bersama.
- Bagian 8.1 dan tabel sumber daya: pengembangan tidak membebani APBD.
- Akun layanan sudah atas nama instansi: rencana pengalihan dihapus dari
  rencana pengembangan, dicatat pada mitigasi risiko.
- 11.4: pengenalan langsung kepada Wali Kota, Wakil Wali Kota, ajudan,
  mitra kerja, dan pengguna internal Bagian Prokopim.

Co-Authored-By: Claude Opus 5.5 <noreply@anthropic.com>
Claude-Session: https://claude.ai/code/session_01TchDZWsQsgeuq52sKmozd1
</commit_message>
<xml_diff>
--- a/docs/lomba/Proposal-Prokopim-Hibot.docx
+++ b/docs/lomba/Proposal-Prokopim-Hibot.docx
@@ -1158,7 +1158,7 @@
           <w:sz w:val="20"/>
           <w:szCs w:val="20"/>
         </w:rPr>
-        <w:t xml:space="preserve">7.2 Pemilihan Ide	9</w:t>
+        <w:t xml:space="preserve">7.2 Pemilihan Ide	10</w:t>
       </w:r>
     </w:p>
     <w:p>
@@ -1348,7 +1348,7 @@
           <w:sz w:val="20"/>
           <w:szCs w:val="20"/>
         </w:rPr>
-        <w:t xml:space="preserve">9.3 Perbandingan Sebelum dan Sesudah	12</w:t>
+        <w:t xml:space="preserve">9.3 Perbandingan Sebelum dan Sesudah	13</w:t>
       </w:r>
     </w:p>
     <w:p>
@@ -1405,7 +1405,7 @@
           <w:sz w:val="20"/>
           <w:szCs w:val="20"/>
         </w:rPr>
-        <w:t xml:space="preserve">9.6 Manfaat Sosial dan Ekonomi	13</w:t>
+        <w:t xml:space="preserve">9.6 Manfaat Sosial dan Ekonomi	14</w:t>
       </w:r>
     </w:p>
     <w:p>
@@ -1481,7 +1481,7 @@
           <w:sz w:val="20"/>
           <w:szCs w:val="20"/>
         </w:rPr>
-        <w:t xml:space="preserve">10.1 Rencana Pengembangan	14</w:t>
+        <w:t xml:space="preserve">10.1 Rencana Pengembangan	15</w:t>
       </w:r>
     </w:p>
     <w:p>
@@ -1576,7 +1576,7 @@
           <w:sz w:val="20"/>
           <w:szCs w:val="20"/>
         </w:rPr>
-        <w:t xml:space="preserve">11.3 Dokumentasi Pengetahuan	15</w:t>
+        <w:t xml:space="preserve">11.3 Dokumentasi Pengetahuan	16</w:t>
       </w:r>
     </w:p>
     <w:p>
@@ -1595,7 +1595,7 @@
           <w:sz w:val="20"/>
           <w:szCs w:val="20"/>
         </w:rPr>
-        <w:t xml:space="preserve">11.4 Diseminasi yang Telah Dilakukan	15</w:t>
+        <w:t xml:space="preserve">11.4 Diseminasi yang Telah Dilakukan	16</w:t>
       </w:r>
     </w:p>
     <w:p>
@@ -8380,6 +8380,35 @@
           <w:sz w:val="22"/>
           <w:szCs w:val="22"/>
         </w:rPr>
+        <w:t xml:space="preserve">Tersambung ke kalender bersama.</w:t>
+      </w:r>
+      <w:r>
+        <w:rPr>
+          <w:rFonts w:ascii="Arial" w:cs="Arial" w:eastAsia="Arial" w:hAnsi="Arial"/>
+          <w:sz w:val="22"/>
+          <w:szCs w:val="22"/>
+        </w:rPr>
+        <w:t xml:space="preserve"> Kegiatan yang telah disetujui tampil dengan sendirinya di Google Calendar bersama yang dapat dilanggani pihak terkait tanpa perlu akun aplikasi. Perubahan dan pembatalan ikut menyesuaikan dalam hitungan detik. Yang dikirim hanya informasi yang layak dilihat pelanggan kalender; nomor narahubung dan catatan internal tidak ikut, dan Kepala Bagian serta Kepala Subbagian Komunikasi dan Dokumentasi Pimpinan dapat menahan kegiatan tertentu agar tidak ditampilkan.</w:t>
+      </w:r>
+    </w:p>
+    <w:p>
+      <w:pPr>
+        <w:pStyle w:val="ListParagraph"/>
+        <w:numPr>
+          <w:ilvl w:val="0"/>
+          <w:numId w:val="6"/>
+        </w:numPr>
+        <w:spacing w:after="60" w:line="276" w:lineRule="auto"/>
+        <w:jc w:val="both"/>
+      </w:pPr>
+      <w:r>
+        <w:rPr>
+          <w:rFonts w:ascii="Arial" w:cs="Arial" w:eastAsia="Arial" w:hAnsi="Arial"/>
+          <w:b/>
+          <w:bCs/>
+          <w:sz w:val="22"/>
+          <w:szCs w:val="22"/>
+        </w:rPr>
         <w:t xml:space="preserve">Prosedur yang terlembaga.</w:t>
       </w:r>
       <w:r>
@@ -9193,7 +9222,7 @@
                 <w:sz w:val="20"/>
                 <w:szCs w:val="20"/>
               </w:rPr>
-              <w:t xml:space="preserve">Layanan publik</w:t>
+              <w:t xml:space="preserve">Kalender bersama</w:t>
             </w:r>
           </w:p>
         </w:tc>
@@ -9225,7 +9254,7 @@
                 <w:sz w:val="20"/>
                 <w:szCs w:val="20"/>
               </w:rPr>
-              <w:t xml:space="preserve">Datang atau menelepon</w:t>
+              <w:t xml:space="preserve">Diisi admin satu per satu secara manual</w:t>
             </w:r>
           </w:p>
         </w:tc>
@@ -9257,7 +9286,7 @@
                 <w:sz w:val="20"/>
                 <w:szCs w:val="20"/>
               </w:rPr>
-              <w:t xml:space="preserve">Kanal daring dengan kode penelusuran</w:t>
+              <w:t xml:space="preserve">Terisi otomatis sesudah persetujuan</w:t>
             </w:r>
           </w:p>
         </w:tc>
@@ -9295,6 +9324,108 @@
                 <w:sz w:val="20"/>
                 <w:szCs w:val="20"/>
               </w:rPr>
+              <w:t xml:space="preserve">Layanan publik</w:t>
+            </w:r>
+          </w:p>
+        </w:tc>
+        <w:tc>
+          <w:tcPr>
+            <w:tcW w:type="dxa" w:w="2987"/>
+            <w:tcBorders>
+              <w:top w:val="single" w:color="000000" w:sz="4"/>
+              <w:left w:val="single" w:color="000000" w:sz="4"/>
+              <w:bottom w:val="single" w:color="000000" w:sz="4"/>
+              <w:right w:val="single" w:color="000000" w:sz="4"/>
+            </w:tcBorders>
+            <w:tcMar>
+              <w:top w:type="dxa" w:w="40"/>
+              <w:left w:type="dxa" w:w="90"/>
+              <w:bottom w:type="dxa" w:w="40"/>
+              <w:right w:type="dxa" w:w="90"/>
+            </w:tcMar>
+            <w:vAlign w:val="top"/>
+          </w:tcPr>
+          <w:p>
+            <w:pPr>
+              <w:spacing w:after="0" w:line="240" w:lineRule="auto"/>
+              <w:jc w:val="left"/>
+            </w:pPr>
+            <w:r>
+              <w:rPr>
+                <w:rFonts w:ascii="Arial" w:cs="Arial" w:eastAsia="Arial" w:hAnsi="Arial"/>
+                <w:sz w:val="20"/>
+                <w:szCs w:val="20"/>
+              </w:rPr>
+              <w:t xml:space="preserve">Datang atau menelepon</w:t>
+            </w:r>
+          </w:p>
+        </w:tc>
+        <w:tc>
+          <w:tcPr>
+            <w:tcW w:type="dxa" w:w="3516"/>
+            <w:tcBorders>
+              <w:top w:val="single" w:color="000000" w:sz="4"/>
+              <w:left w:val="single" w:color="000000" w:sz="4"/>
+              <w:bottom w:val="single" w:color="000000" w:sz="4"/>
+              <w:right w:val="single" w:color="000000" w:sz="4"/>
+            </w:tcBorders>
+            <w:tcMar>
+              <w:top w:type="dxa" w:w="40"/>
+              <w:left w:type="dxa" w:w="90"/>
+              <w:bottom w:type="dxa" w:w="40"/>
+              <w:right w:type="dxa" w:w="90"/>
+            </w:tcMar>
+            <w:vAlign w:val="top"/>
+          </w:tcPr>
+          <w:p>
+            <w:pPr>
+              <w:spacing w:after="0" w:line="240" w:lineRule="auto"/>
+              <w:jc w:val="left"/>
+            </w:pPr>
+            <w:r>
+              <w:rPr>
+                <w:rFonts w:ascii="Arial" w:cs="Arial" w:eastAsia="Arial" w:hAnsi="Arial"/>
+                <w:sz w:val="20"/>
+                <w:szCs w:val="20"/>
+              </w:rPr>
+              <w:t xml:space="preserve">Kanal daring dengan kode penelusuran</w:t>
+            </w:r>
+          </w:p>
+        </w:tc>
+      </w:tr>
+      <w:tr>
+        <w:trPr>
+          <w:cantSplit/>
+          <w:tblHeader w:val="false"/>
+        </w:trPr>
+        <w:tc>
+          <w:tcPr>
+            <w:tcW w:type="dxa" w:w="2284"/>
+            <w:tcBorders>
+              <w:top w:val="single" w:color="000000" w:sz="4"/>
+              <w:left w:val="single" w:color="000000" w:sz="4"/>
+              <w:bottom w:val="single" w:color="000000" w:sz="4"/>
+              <w:right w:val="single" w:color="000000" w:sz="4"/>
+            </w:tcBorders>
+            <w:tcMar>
+              <w:top w:type="dxa" w:w="40"/>
+              <w:left w:type="dxa" w:w="90"/>
+              <w:bottom w:type="dxa" w:w="40"/>
+              <w:right w:type="dxa" w:w="90"/>
+            </w:tcMar>
+            <w:vAlign w:val="top"/>
+          </w:tcPr>
+          <w:p>
+            <w:pPr>
+              <w:spacing w:after="0" w:line="240" w:lineRule="auto"/>
+              <w:jc w:val="left"/>
+            </w:pPr>
+            <w:r>
+              <w:rPr>
+                <w:rFonts w:ascii="Arial" w:cs="Arial" w:eastAsia="Arial" w:hAnsi="Arial"/>
+                <w:sz w:val="20"/>
+                <w:szCs w:val="20"/>
+              </w:rPr>
               <w:t xml:space="preserve">Prosedur</w:t>
             </w:r>
           </w:p>
@@ -9382,7 +9513,7 @@
           <w:sz w:val="22"/>
           <w:szCs w:val="22"/>
         </w:rPr>
-        <w:t xml:space="preserve">Dibandingkan kalender bersama atau grup percakapan yang lazim dipakai, Prokopim Hibot memiliki jenjang persetujuan, pembagian kewenangan menurut jabatan, dan jejak keputusan yang tidak dimiliki keduanya. Aplikasi ini juga tidak menggantikan aplikasi persuratan: nomor surat tetap diterbitkan melalui aplikasi persuratan resmi, sedangkan Prokopim Hibot mengelola tindak lanjut kegiatannya.</w:t>
+        <w:t xml:space="preserve">Kalender bersama dan grup percakapan yang lazim dipakai tidak memiliki jenjang persetujuan, pembagian kewenangan menurut jabatan, dan jejak keputusan. Prokopim Hibot tidak menggantikan kalender bersama, tetapi mengisinya secara otomatis, sehingga kalender hanya memuat kegiatan yang telah disetujui. Aplikasi ini juga tidak menggantikan aplikasi persuratan: nomor surat tetap diterbitkan melalui aplikasi persuratan resmi, sedangkan Prokopim Hibot mengelola tindak lanjut kegiatannya.</w:t>
       </w:r>
     </w:p>
     <w:p>
@@ -11338,7 +11469,7 @@
                 <w:sz w:val="20"/>
                 <w:szCs w:val="20"/>
               </w:rPr>
-              <w:t xml:space="preserve">Pelaksana Harian; daftar periksa wajib sebelum persetujuan; penanda kegentingan dan pemantauan usulan perubahan</w:t>
+              <w:t xml:space="preserve">Pelaksana Harian; daftar periksa wajib sebelum persetujuan; penanda kegentingan dan pemantauan usulan perubahan; sinkron otomatis ke kalender bersama</w:t>
             </w:r>
           </w:p>
         </w:tc>
@@ -11361,7 +11492,7 @@
           <w:sz w:val="22"/>
           <w:szCs w:val="22"/>
         </w:rPr>
-        <w:t xml:space="preserve">Sepanjang Maret sampai September 2026 tercatat lebih dari 570 pembaruan aplikasi dalam lebih dari 80 hari pengembangan. Sebagian besar pembaruan berangkat dari kendala yang dilaporkan pengguna, sehingga aplikasi berkembang mengikuti kebutuhan nyata.</w:t>
+        <w:t xml:space="preserve">Sepanjang Maret sampai September 2026 tercatat lebih dari 580 pembaruan aplikasi dalam lebih dari 90 hari pengembangan. Sebagian besar pembaruan berangkat dari kendala yang dilaporkan pengguna, sehingga aplikasi berkembang mengikuti kebutuhan nyata.</w:t>
       </w:r>
     </w:p>
     <w:p>
@@ -11892,7 +12023,7 @@
           <w:sz w:val="22"/>
           <w:szCs w:val="22"/>
         </w:rPr>
-        <w:t xml:space="preserve">Pengembangan dilakukan secara swakelola oleh Ketua Tim selaku Kepala Bagian, dengan memanfaatkan asisten pemrograman berbasis kecerdasan buatan, sehingga tidak memerlukan jasa pengembang dari pihak ketiga. Anggota tim dan sebelas pelaksana Bagian Prokopim berperan sebagai pengguna harian sekaligus penguji, serta menjadi sumber kebutuhan setiap penyempurnaan. Pelaksanaannya diperkuat Tim Koordinasi beranggotakan 42 orang berdasarkan Keputusan Sekretaris Daerah, yang juga melibatkan para Sekretaris Dinas di lingkungan Pemerintah Kota Tarakan.</w:t>
+        <w:t xml:space="preserve">Pengembangan dilakukan secara swakelola oleh Ketua Tim selaku Kepala Bagian, dengan memanfaatkan asisten pemrograman berbasis kecerdasan buatan, sehingga tidak memerlukan jasa pengembang dari pihak ketiga dan tidak membebani APBD. Anggota tim dan sebelas pelaksana Bagian Prokopim berperan sebagai pengguna harian sekaligus penguji, serta menjadi sumber kebutuhan setiap penyempurnaan. Pelaksanaannya diperkuat Tim Koordinasi beranggotakan 42 orang berdasarkan Keputusan Sekretaris Daerah, yang juga melibatkan para Sekretaris Dinas di lingkungan Pemerintah Kota Tarakan.</w:t>
       </w:r>
     </w:p>
     <w:p>
@@ -12679,7 +12810,7 @@
                 <w:sz w:val="20"/>
                 <w:szCs w:val="20"/>
               </w:rPr>
-              <w:t xml:space="preserve">Perangkat</w:t>
+              <w:t xml:space="preserve">Kalender bersama</w:t>
             </w:r>
           </w:p>
         </w:tc>
@@ -12711,7 +12842,7 @@
                 <w:sz w:val="20"/>
                 <w:szCs w:val="20"/>
               </w:rPr>
-              <w:t xml:space="preserve">Telepon pintar milik pengguna; tanpa toko aplikasi</w:t>
+              <w:t xml:space="preserve">Layanan kalender pada kuota tanpa biaya, memakai akun layanan atas nama instansi</w:t>
             </w:r>
           </w:p>
         </w:tc>
@@ -12781,6 +12912,108 @@
                 <w:sz w:val="20"/>
                 <w:szCs w:val="20"/>
               </w:rPr>
+              <w:t xml:space="preserve">Perangkat</w:t>
+            </w:r>
+          </w:p>
+        </w:tc>
+        <w:tc>
+          <w:tcPr>
+            <w:tcW w:type="dxa" w:w="5272"/>
+            <w:tcBorders>
+              <w:top w:val="single" w:color="000000" w:sz="4"/>
+              <w:left w:val="single" w:color="000000" w:sz="4"/>
+              <w:bottom w:val="single" w:color="000000" w:sz="4"/>
+              <w:right w:val="single" w:color="000000" w:sz="4"/>
+            </w:tcBorders>
+            <w:tcMar>
+              <w:top w:type="dxa" w:w="40"/>
+              <w:left w:type="dxa" w:w="90"/>
+              <w:bottom w:type="dxa" w:w="40"/>
+              <w:right w:type="dxa" w:w="90"/>
+            </w:tcMar>
+            <w:vAlign w:val="top"/>
+          </w:tcPr>
+          <w:p>
+            <w:pPr>
+              <w:spacing w:after="0" w:line="240" w:lineRule="auto"/>
+              <w:jc w:val="left"/>
+            </w:pPr>
+            <w:r>
+              <w:rPr>
+                <w:rFonts w:ascii="Arial" w:cs="Arial" w:eastAsia="Arial" w:hAnsi="Arial"/>
+                <w:sz w:val="20"/>
+                <w:szCs w:val="20"/>
+              </w:rPr>
+              <w:t xml:space="preserve">Telepon pintar milik pengguna; tanpa toko aplikasi</w:t>
+            </w:r>
+          </w:p>
+        </w:tc>
+        <w:tc>
+          <w:tcPr>
+            <w:tcW w:type="dxa" w:w="1758"/>
+            <w:tcBorders>
+              <w:top w:val="single" w:color="000000" w:sz="4"/>
+              <w:left w:val="single" w:color="000000" w:sz="4"/>
+              <w:bottom w:val="single" w:color="000000" w:sz="4"/>
+              <w:right w:val="single" w:color="000000" w:sz="4"/>
+            </w:tcBorders>
+            <w:tcMar>
+              <w:top w:type="dxa" w:w="40"/>
+              <w:left w:type="dxa" w:w="90"/>
+              <w:bottom w:type="dxa" w:w="40"/>
+              <w:right w:type="dxa" w:w="90"/>
+            </w:tcMar>
+            <w:vAlign w:val="top"/>
+          </w:tcPr>
+          <w:p>
+            <w:pPr>
+              <w:spacing w:after="0" w:line="240" w:lineRule="auto"/>
+              <w:jc w:val="left"/>
+            </w:pPr>
+            <w:r>
+              <w:rPr>
+                <w:rFonts w:ascii="Arial" w:cs="Arial" w:eastAsia="Arial" w:hAnsi="Arial"/>
+                <w:sz w:val="20"/>
+                <w:szCs w:val="20"/>
+              </w:rPr>
+              <w:t xml:space="preserve">Rp0</w:t>
+            </w:r>
+          </w:p>
+        </w:tc>
+      </w:tr>
+      <w:tr>
+        <w:trPr>
+          <w:cantSplit/>
+          <w:tblHeader w:val="false"/>
+        </w:trPr>
+        <w:tc>
+          <w:tcPr>
+            <w:tcW w:type="dxa" w:w="1757"/>
+            <w:tcBorders>
+              <w:top w:val="single" w:color="000000" w:sz="4"/>
+              <w:left w:val="single" w:color="000000" w:sz="4"/>
+              <w:bottom w:val="single" w:color="000000" w:sz="4"/>
+              <w:right w:val="single" w:color="000000" w:sz="4"/>
+            </w:tcBorders>
+            <w:tcMar>
+              <w:top w:type="dxa" w:w="40"/>
+              <w:left w:type="dxa" w:w="90"/>
+              <w:bottom w:type="dxa" w:w="40"/>
+              <w:right w:type="dxa" w:w="90"/>
+            </w:tcMar>
+            <w:vAlign w:val="top"/>
+          </w:tcPr>
+          <w:p>
+            <w:pPr>
+              <w:spacing w:after="0" w:line="240" w:lineRule="auto"/>
+              <w:jc w:val="left"/>
+            </w:pPr>
+            <w:r>
+              <w:rPr>
+                <w:rFonts w:ascii="Arial" w:cs="Arial" w:eastAsia="Arial" w:hAnsi="Arial"/>
+                <w:sz w:val="20"/>
+                <w:szCs w:val="20"/>
+              </w:rPr>
               <w:t xml:space="preserve">Pengembangan</w:t>
             </w:r>
           </w:p>
@@ -12813,7 +13046,7 @@
                 <w:sz w:val="20"/>
                 <w:szCs w:val="20"/>
               </w:rPr>
-              <w:t xml:space="preserve">Swakelola oleh Ketua Tim</w:t>
+              <w:t xml:space="preserve">Swakelola oleh Ketua Tim; tidak membebani APBD</w:t>
             </w:r>
           </w:p>
         </w:tc>
@@ -16430,7 +16663,7 @@
                 <w:sz w:val="20"/>
                 <w:szCs w:val="20"/>
               </w:rPr>
-              <w:t xml:space="preserve">Pembaruan berkelanjutan berdasarkan masukan pengguna; lebih dari 570 pembaruan sejak Maret 2026</w:t>
+              <w:t xml:space="preserve">Pembaruan berkelanjutan berdasarkan masukan pengguna; lebih dari 580 pembaruan sejak Maret 2026</w:t>
             </w:r>
           </w:p>
         </w:tc>
@@ -16837,7 +17070,7 @@
                 <w:sz w:val="20"/>
                 <w:szCs w:val="20"/>
               </w:rPr>
-              <w:t xml:space="preserve">Pengesahan SOP; pengalihan akun layanan ke akun resmi instansi</w:t>
+              <w:t xml:space="preserve">Pengesahan SOP oleh Sekretaris Daerah</w:t>
             </w:r>
           </w:p>
         </w:tc>
@@ -17174,7 +17407,7 @@
                 <w:sz w:val="20"/>
                 <w:szCs w:val="20"/>
               </w:rPr>
-              <w:t xml:space="preserve">Prosedur telah terdokumentasi dalam sebelas SOP; kode tersimpan dalam repositori dengan riwayat perubahan lengkap; alih pengetahuan kepada pengelola kedua dijadwalkan pada 2027</w:t>
+              <w:t xml:space="preserve">Prosedur telah terdokumentasi dalam sebelas SOP; kode tersimpan dalam repositori dengan riwayat perubahan lengkap; akun layanan terdaftar atas nama instansi; alih pengetahuan kepada pengelola kedua dijadwalkan pada 2027</w:t>
             </w:r>
           </w:p>
         </w:tc>
@@ -18026,7 +18259,7 @@
           <w:sz w:val="22"/>
           <w:szCs w:val="22"/>
         </w:rPr>
-        <w:t xml:space="preserve">Pengguna di luar Bagian Prokopim.</w:t>
+        <w:t xml:space="preserve">Pengenalan langsung kepada pengguna.</w:t>
       </w:r>
       <w:r>
         <w:rPr>
@@ -18034,7 +18267,7 @@
           <w:sz w:val="22"/>
           <w:szCs w:val="22"/>
         </w:rPr>
-        <w:t xml:space="preserve"> Pimpinan Daerah, ajudan, pengawal pribadi, dan 9 akun mitra kerja Pemerintah Kota menggunakan aplikasi secara rutin.</w:t>
+        <w:t xml:space="preserve"> Aplikasi diperkenalkan langsung kepada Wali Kota dan Wakil Wali Kota, para ajudan, mitra kerja, dan seluruh pengguna internal Bagian Prokopim. Kini Pimpinan Daerah, ajudan, pengawal pribadi, dan 9 akun mitra kerja Pemerintah Kota menggunakannya secara rutin.</w:t>
       </w:r>
     </w:p>
     <w:p>

</xml_diff>

<commit_message>
Proposal: Mastura, Perwali 50/2021, KTP di luar git; format SOP PermenPAN
- Anggota tim: Mastura, S.Sos. menggantikan Nuraini Wiliadewi, S.IP.
  (sesuai SK nomor urut 34); revisi kecil dari naskah suntingan.
- Dasar tugas Bagian menurut Perwali Tarakan 50/2021 di Bagian 4.1 dan
  kolom dasar tugas pada tabel alur kerja; sebutan Kepala Sub Bagian.
- Lampiran 3: pindaian KTP hanya masuk PDF final di docs/lomba/rahasia/
  yang dikecualikan dari git; salinan repositori tidak memuat NIK.
- Pembuat PDF SOP mengikuti PermenPAN-RB 35/2012: halaman judul berlambang
  dan beralamat, rancangan keputusan penetapan, daftar isi, bagian
  identitas bergaya Gambar 3 dengan ruang pengesahan dan NIP, serta
  penghubung segilima pada setiap pemenggalan halaman.

Co-Authored-By: Claude Opus 5.5 <noreply@anthropic.com>
Claude-Session: https://claude.ai/code/session_01TchDZWsQsgeuq52sKmozd1
</commit_message>
<xml_diff>
--- a/docs/lomba/Proposal-Prokopim-Hibot.docx
+++ b/docs/lomba/Proposal-Prokopim-Hibot.docx
@@ -835,7 +835,7 @@
           <w:sz w:val="20"/>
           <w:szCs w:val="20"/>
         </w:rPr>
-        <w:t xml:space="preserve">4.4 Akar Masalah	3</w:t>
+        <w:t xml:space="preserve">4.4 Akar Masalah	4</w:t>
       </w:r>
     </w:p>
     <w:p>
@@ -892,7 +892,7 @@
           <w:sz w:val="22"/>
           <w:szCs w:val="22"/>
         </w:rPr>
-        <w:t xml:space="preserve">5. KESELARASAN DENGAN BIDANG FOKUS DAN RPJMD	4</w:t>
+        <w:t xml:space="preserve">5. KESELARASAN DENGAN BIDANG FOKUS DAN RPJMD	5</w:t>
       </w:r>
     </w:p>
     <w:p>
@@ -911,7 +911,7 @@
           <w:sz w:val="20"/>
           <w:szCs w:val="20"/>
         </w:rPr>
-        <w:t xml:space="preserve">5.1 Bidang Fokus Utama	4</w:t>
+        <w:t xml:space="preserve">5.1 Bidang Fokus Utama	5</w:t>
       </w:r>
     </w:p>
     <w:p>
@@ -987,7 +987,7 @@
           <w:sz w:val="22"/>
           <w:szCs w:val="22"/>
         </w:rPr>
-        <w:t xml:space="preserve">6. DESKRIPSI DAN KEBARUAN INOVASI	6</w:t>
+        <w:t xml:space="preserve">6. DESKRIPSI DAN KEBARUAN INOVASI	7</w:t>
       </w:r>
     </w:p>
     <w:p>
@@ -1006,7 +1006,7 @@
           <w:sz w:val="20"/>
           <w:szCs w:val="20"/>
         </w:rPr>
-        <w:t xml:space="preserve">6.1 Konsep	6</w:t>
+        <w:t xml:space="preserve">6.1 Konsep	7</w:t>
       </w:r>
     </w:p>
     <w:p>
@@ -1063,7 +1063,7 @@
           <w:sz w:val="20"/>
           <w:szCs w:val="20"/>
         </w:rPr>
-        <w:t xml:space="preserve">6.4 Unsur Kebaruan	7</w:t>
+        <w:t xml:space="preserve">6.4 Unsur Kebaruan	8</w:t>
       </w:r>
     </w:p>
     <w:p>
@@ -1139,7 +1139,7 @@
           <w:sz w:val="20"/>
           <w:szCs w:val="20"/>
         </w:rPr>
-        <w:t xml:space="preserve">7.1 Penjaringan Ide	9</w:t>
+        <w:t xml:space="preserve">7.1 Penjaringan Ide	10</w:t>
       </w:r>
     </w:p>
     <w:p>
@@ -1196,7 +1196,7 @@
           <w:sz w:val="20"/>
           <w:szCs w:val="20"/>
         </w:rPr>
-        <w:t xml:space="preserve">7.4 SOP, Keputusan Pendukung, dan Dokumentasi	10</w:t>
+        <w:t xml:space="preserve">7.4 SOP, Keputusan Pendukung, dan Dokumentasi	11</w:t>
       </w:r>
     </w:p>
     <w:p>
@@ -1272,7 +1272,7 @@
           <w:sz w:val="20"/>
           <w:szCs w:val="20"/>
         </w:rPr>
-        <w:t xml:space="preserve">8.3 Sumber Daya Lainnya dan Efisiensi	11</w:t>
+        <w:t xml:space="preserve">8.3 Sumber Daya Lainnya dan Efisiensi	12</w:t>
       </w:r>
     </w:p>
     <w:p>
@@ -1329,7 +1329,7 @@
           <w:sz w:val="20"/>
           <w:szCs w:val="20"/>
         </w:rPr>
-        <w:t xml:space="preserve">9.2 Pertumbuhan Penggunaan	12</w:t>
+        <w:t xml:space="preserve">9.2 Pertumbuhan Penggunaan	13</w:t>
       </w:r>
     </w:p>
     <w:p>
@@ -1386,7 +1386,7 @@
           <w:sz w:val="20"/>
           <w:szCs w:val="20"/>
         </w:rPr>
-        <w:t xml:space="preserve">9.5 Jangkauan Layanan Publik	13</w:t>
+        <w:t xml:space="preserve">9.5 Jangkauan Layanan Publik	14</w:t>
       </w:r>
     </w:p>
     <w:p>
@@ -1557,7 +1557,7 @@
           <w:sz w:val="20"/>
           <w:szCs w:val="20"/>
         </w:rPr>
-        <w:t xml:space="preserve">11.2 Syarat Replikasi	15</w:t>
+        <w:t xml:space="preserve">11.2 Syarat Replikasi	16</w:t>
       </w:r>
     </w:p>
     <w:p>
@@ -1687,7 +1687,7 @@
           <w:sz w:val="22"/>
           <w:szCs w:val="22"/>
         </w:rPr>
-        <w:t xml:space="preserve">Bagian Protokol dan Komunikasi Pimpinan (Bagian Prokopim) Sekretariat Daerah Kota Tarakan bertugas menyusun, memeriksa, dan mengawal agenda Wali Kota dan Wakil Wali Kota. Volume yang ditangani rata-rata mencapai 87 kegiatan setiap bulan, dan setiap kegiatan melewati paling sedikit tiga jenjang pemeriksaan sebelum ditetapkan.</w:t>
+        <w:t xml:space="preserve">Bagian Protokol dan Komunikasi Pimpinan (Bagian Prokopim) Sekretariat Daerah Kota Tarakan memiliki tugas antara lain menyusun, memeriksa, dan mengawal agenda Wali Kota dan Wakil Wali Kota. Volume yang ditangani rata-rata mencapai 87 kegiatan setiap bulan, dan setiap kegiatan melewati paling sedikit tiga jenjang pemeriksaan sebelum ditetapkan.</w:t>
       </w:r>
     </w:p>
     <w:p>
@@ -2956,7 +2956,7 @@
                 <w:sz w:val="20"/>
                 <w:szCs w:val="20"/>
               </w:rPr>
-              <w:t xml:space="preserve">Kepala Subbagian Protokol</w:t>
+              <w:t xml:space="preserve">Kepala Sub Bagian Protokol</w:t>
             </w:r>
           </w:p>
         </w:tc>
@@ -3106,7 +3106,7 @@
                 <w:sz w:val="20"/>
                 <w:szCs w:val="20"/>
               </w:rPr>
-              <w:t xml:space="preserve">Kepala Subbagian Komunikasi dan Dokumentasi Pimpinan</w:t>
+              <w:t xml:space="preserve">Kepala Sub Bagian Komunikasi dan Dokumentasi Pimpinan</w:t>
             </w:r>
           </w:p>
         </w:tc>
@@ -3242,7 +3242,7 @@
                 <w:sz w:val="20"/>
                 <w:szCs w:val="20"/>
               </w:rPr>
-              <w:t xml:space="preserve">Nuraini Wiliadewi, S.IP.</w:t>
+              <w:t xml:space="preserve">Mastura, S.Sos.</w:t>
             </w:r>
           </w:p>
           <w:p>
@@ -3537,7 +3537,7 @@
           <w:sz w:val="22"/>
           <w:szCs w:val="22"/>
         </w:rPr>
-        <w:t xml:space="preserve"> ponsel/WhatsApp 0811-5900-394; surel anugrahyegapranatha@gmail.com.</w:t>
+        <w:t xml:space="preserve"> ponsel/WA 0811-5900-394; surel anugrahyegapranatha@gmail.com.</w:t>
       </w:r>
     </w:p>
     <w:p>
@@ -3577,6 +3577,21 @@
           <w:rFonts w:ascii="Arial" w:cs="Arial" w:eastAsia="Arial" w:hAnsi="Arial"/>
         </w:rPr>
         <w:t xml:space="preserve">4.1 Data Dasar</w:t>
+      </w:r>
+    </w:p>
+    <w:p>
+      <w:pPr>
+        <w:spacing w:after="100" w:before="0" w:line="276" w:lineRule="auto"/>
+        <w:ind w:firstLine="567"/>
+        <w:jc w:val="both"/>
+      </w:pPr>
+      <w:r>
+        <w:rPr>
+          <w:rFonts w:ascii="Arial" w:cs="Arial" w:eastAsia="Arial" w:hAnsi="Arial"/>
+          <w:sz w:val="22"/>
+          <w:szCs w:val="22"/>
+        </w:rPr>
+        <w:t xml:space="preserve">Berdasarkan Peraturan Wali Kota Tarakan Nomor 50 Tahun 2021 tentang Kedudukan, Susunan Organisasi, Tugas dan Fungsi serta Tata Kerja Sekretariat Daerah, Bagian Prokopim membantu Asisten Administrasi Umum di bidang protokol, komunikasi pimpinan, dan dokumentasi (Pasal 49). Tugas itu dijalankan oleh dua unit: Sub Bagian Protokol, antara lain menyiapkan bahan informasi acara dan jadwal kegiatan Kepala Daerah dan Wakil Kepala Daerah serta mengoordinasikan dan memfasilitasi kegiatannya (Pasal 52); dan Sub Bagian Komunikasi dan Dokumentasi Pimpinan, antara lain menyusun naskah sambutan, mendokumentasikan kegiatan, dan memfasilitasi peliputan media (Pasal 54).</w:t>
       </w:r>
     </w:p>
     <w:p>
@@ -3881,7 +3896,7 @@
                 <w:sz w:val="20"/>
                 <w:szCs w:val="20"/>
               </w:rPr>
-              <w:t xml:space="preserve">Kepala Subbagian dan Kepala Bagian memeriksa dalam satu jendela waktu sekitar 30 menit menjelang jam pulang kantor, hanya pada hari kerja; disposisi Pimpinan diterima malam atau pagi harinya</w:t>
+              <w:t xml:space="preserve">Kepala Sub Bagian dan Kepala Bagian memeriksa dalam satu jendela waktu sekitar 30 menit menjelang jam pulang kantor, hanya pada hari kerja; disposisi Pimpinan diterima malam atau pagi harinya</w:t>
             </w:r>
           </w:p>
         </w:tc>
@@ -4878,7 +4893,7 @@
                 <w:sz w:val="20"/>
                 <w:szCs w:val="20"/>
               </w:rPr>
-              <w:t xml:space="preserve">Kepala Bagian dan Kepala Subbagian</w:t>
+              <w:t xml:space="preserve">Kepala Bagian dan Kepala Sub Bagian</w:t>
             </w:r>
           </w:p>
         </w:tc>
@@ -6671,7 +6686,7 @@
                 <w:sz w:val="20"/>
                 <w:szCs w:val="20"/>
               </w:rPr>
-              <w:t xml:space="preserve">Kepala Subbagian Protokol</w:t>
+              <w:t xml:space="preserve">Kepala Sub Bagian Protokol</w:t>
             </w:r>
           </w:p>
           <w:p>
@@ -6946,9 +6961,10 @@
         </w:tblBorders>
       </w:tblPr>
       <w:tblGrid>
-        <w:gridCol w:w="615"/>
-        <w:gridCol w:w="2460"/>
-        <w:gridCol w:w="5712"/>
+        <w:gridCol w:w="527"/>
+        <w:gridCol w:w="1933"/>
+        <w:gridCol w:w="4042"/>
+        <w:gridCol w:w="2285"/>
       </w:tblGrid>
       <w:tr>
         <w:trPr>
@@ -6957,7 +6973,7 @@
         </w:trPr>
         <w:tc>
           <w:tcPr>
-            <w:tcW w:type="dxa" w:w="615"/>
+            <w:tcW w:type="dxa" w:w="527"/>
             <w:tcBorders>
               <w:top w:val="single" w:color="000000" w:sz="4"/>
               <w:left w:val="single" w:color="000000" w:sz="4"/>
@@ -6992,7 +7008,7 @@
         </w:tc>
         <w:tc>
           <w:tcPr>
-            <w:tcW w:type="dxa" w:w="2460"/>
+            <w:tcW w:type="dxa" w:w="1933"/>
             <w:tcBorders>
               <w:top w:val="single" w:color="000000" w:sz="4"/>
               <w:left w:val="single" w:color="000000" w:sz="4"/>
@@ -7027,7 +7043,7 @@
         </w:tc>
         <w:tc>
           <w:tcPr>
-            <w:tcW w:type="dxa" w:w="5712"/>
+            <w:tcW w:type="dxa" w:w="4042"/>
             <w:tcBorders>
               <w:top w:val="single" w:color="000000" w:sz="4"/>
               <w:left w:val="single" w:color="000000" w:sz="4"/>
@@ -7057,6 +7073,41 @@
                 <w:szCs w:val="20"/>
               </w:rPr>
               <w:t xml:space="preserve">Cara kerja pokok</w:t>
+            </w:r>
+          </w:p>
+        </w:tc>
+        <w:tc>
+          <w:tcPr>
+            <w:tcW w:type="dxa" w:w="2285"/>
+            <w:tcBorders>
+              <w:top w:val="single" w:color="000000" w:sz="4"/>
+              <w:left w:val="single" w:color="000000" w:sz="4"/>
+              <w:bottom w:val="single" w:color="000000" w:sz="4"/>
+              <w:right w:val="single" w:color="000000" w:sz="4"/>
+            </w:tcBorders>
+            <w:shd w:fill="D9D9D9" w:color="auto" w:val="clear"/>
+            <w:tcMar>
+              <w:top w:type="dxa" w:w="40"/>
+              <w:left w:type="dxa" w:w="90"/>
+              <w:bottom w:type="dxa" w:w="40"/>
+              <w:right w:type="dxa" w:w="90"/>
+            </w:tcMar>
+            <w:vAlign w:val="center"/>
+          </w:tcPr>
+          <w:p>
+            <w:pPr>
+              <w:spacing w:after="0" w:line="240" w:lineRule="auto"/>
+              <w:jc w:val="center"/>
+            </w:pPr>
+            <w:r>
+              <w:rPr>
+                <w:rFonts w:ascii="Arial" w:cs="Arial" w:eastAsia="Arial" w:hAnsi="Arial"/>
+                <w:b/>
+                <w:bCs/>
+                <w:sz w:val="20"/>
+                <w:szCs w:val="20"/>
+              </w:rPr>
+              <w:t xml:space="preserve">Dasar tugas</w:t>
             </w:r>
           </w:p>
         </w:tc>
@@ -7068,7 +7119,7 @@
         </w:trPr>
         <w:tc>
           <w:tcPr>
-            <w:tcW w:type="dxa" w:w="615"/>
+            <w:tcW w:type="dxa" w:w="527"/>
             <w:tcBorders>
               <w:top w:val="single" w:color="000000" w:sz="4"/>
               <w:left w:val="single" w:color="000000" w:sz="4"/>
@@ -7100,7 +7151,7 @@
         </w:tc>
         <w:tc>
           <w:tcPr>
-            <w:tcW w:type="dxa" w:w="2460"/>
+            <w:tcW w:type="dxa" w:w="1933"/>
             <w:tcBorders>
               <w:top w:val="single" w:color="000000" w:sz="4"/>
               <w:left w:val="single" w:color="000000" w:sz="4"/>
@@ -7132,7 +7183,7 @@
         </w:tc>
         <w:tc>
           <w:tcPr>
-            <w:tcW w:type="dxa" w:w="5712"/>
+            <w:tcW w:type="dxa" w:w="4042"/>
             <w:tcBorders>
               <w:top w:val="single" w:color="000000" w:sz="4"/>
               <w:left w:val="single" w:color="000000" w:sz="4"/>
@@ -7159,6 +7210,38 @@
                 <w:szCs w:val="20"/>
               </w:rPr>
               <w:t xml:space="preserve">Tiga jenjang; pemeriksaan benturan jadwal Pimpinan secara otomatis</w:t>
+            </w:r>
+          </w:p>
+        </w:tc>
+        <w:tc>
+          <w:tcPr>
+            <w:tcW w:type="dxa" w:w="2285"/>
+            <w:tcBorders>
+              <w:top w:val="single" w:color="000000" w:sz="4"/>
+              <w:left w:val="single" w:color="000000" w:sz="4"/>
+              <w:bottom w:val="single" w:color="000000" w:sz="4"/>
+              <w:right w:val="single" w:color="000000" w:sz="4"/>
+            </w:tcBorders>
+            <w:tcMar>
+              <w:top w:type="dxa" w:w="40"/>
+              <w:left w:type="dxa" w:w="90"/>
+              <w:bottom w:type="dxa" w:w="40"/>
+              <w:right w:type="dxa" w:w="90"/>
+            </w:tcMar>
+            <w:vAlign w:val="top"/>
+          </w:tcPr>
+          <w:p>
+            <w:pPr>
+              <w:spacing w:after="0" w:line="240" w:lineRule="auto"/>
+              <w:jc w:val="left"/>
+            </w:pPr>
+            <w:r>
+              <w:rPr>
+                <w:rFonts w:ascii="Arial" w:cs="Arial" w:eastAsia="Arial" w:hAnsi="Arial"/>
+                <w:sz w:val="20"/>
+                <w:szCs w:val="20"/>
+              </w:rPr>
+              <w:t xml:space="preserve">Pasal 52 huruf c, d</w:t>
             </w:r>
           </w:p>
         </w:tc>
@@ -7170,7 +7253,7 @@
         </w:trPr>
         <w:tc>
           <w:tcPr>
-            <w:tcW w:type="dxa" w:w="615"/>
+            <w:tcW w:type="dxa" w:w="527"/>
             <w:tcBorders>
               <w:top w:val="single" w:color="000000" w:sz="4"/>
               <w:left w:val="single" w:color="000000" w:sz="4"/>
@@ -7202,7 +7285,7 @@
         </w:tc>
         <w:tc>
           <w:tcPr>
-            <w:tcW w:type="dxa" w:w="2460"/>
+            <w:tcW w:type="dxa" w:w="1933"/>
             <w:tcBorders>
               <w:top w:val="single" w:color="000000" w:sz="4"/>
               <w:left w:val="single" w:color="000000" w:sz="4"/>
@@ -7234,7 +7317,7 @@
         </w:tc>
         <w:tc>
           <w:tcPr>
-            <w:tcW w:type="dxa" w:w="5712"/>
+            <w:tcW w:type="dxa" w:w="4042"/>
             <w:tcBorders>
               <w:top w:val="single" w:color="000000" w:sz="4"/>
               <w:left w:val="single" w:color="000000" w:sz="4"/>
@@ -7261,6 +7344,38 @@
                 <w:szCs w:val="20"/>
               </w:rPr>
               <w:t xml:space="preserve">Diajukan berjenjang; jadwal tetap tayang dengan data lama selama usulan diproses</w:t>
+            </w:r>
+          </w:p>
+        </w:tc>
+        <w:tc>
+          <w:tcPr>
+            <w:tcW w:type="dxa" w:w="2285"/>
+            <w:tcBorders>
+              <w:top w:val="single" w:color="000000" w:sz="4"/>
+              <w:left w:val="single" w:color="000000" w:sz="4"/>
+              <w:bottom w:val="single" w:color="000000" w:sz="4"/>
+              <w:right w:val="single" w:color="000000" w:sz="4"/>
+            </w:tcBorders>
+            <w:tcMar>
+              <w:top w:type="dxa" w:w="40"/>
+              <w:left w:type="dxa" w:w="90"/>
+              <w:bottom w:type="dxa" w:w="40"/>
+              <w:right w:type="dxa" w:w="90"/>
+            </w:tcMar>
+            <w:vAlign w:val="top"/>
+          </w:tcPr>
+          <w:p>
+            <w:pPr>
+              <w:spacing w:after="0" w:line="240" w:lineRule="auto"/>
+              <w:jc w:val="left"/>
+            </w:pPr>
+            <w:r>
+              <w:rPr>
+                <w:rFonts w:ascii="Arial" w:cs="Arial" w:eastAsia="Arial" w:hAnsi="Arial"/>
+                <w:sz w:val="20"/>
+                <w:szCs w:val="20"/>
+              </w:rPr>
+              <w:t xml:space="preserve">Pasal 52 huruf c, d</w:t>
             </w:r>
           </w:p>
         </w:tc>
@@ -7272,7 +7387,7 @@
         </w:trPr>
         <w:tc>
           <w:tcPr>
-            <w:tcW w:type="dxa" w:w="615"/>
+            <w:tcW w:type="dxa" w:w="527"/>
             <w:tcBorders>
               <w:top w:val="single" w:color="000000" w:sz="4"/>
               <w:left w:val="single" w:color="000000" w:sz="4"/>
@@ -7304,7 +7419,7 @@
         </w:tc>
         <w:tc>
           <w:tcPr>
-            <w:tcW w:type="dxa" w:w="2460"/>
+            <w:tcW w:type="dxa" w:w="1933"/>
             <w:tcBorders>
               <w:top w:val="single" w:color="000000" w:sz="4"/>
               <w:left w:val="single" w:color="000000" w:sz="4"/>
@@ -7336,7 +7451,7 @@
         </w:tc>
         <w:tc>
           <w:tcPr>
-            <w:tcW w:type="dxa" w:w="5712"/>
+            <w:tcW w:type="dxa" w:w="4042"/>
             <w:tcBorders>
               <w:top w:val="single" w:color="000000" w:sz="4"/>
               <w:left w:val="single" w:color="000000" w:sz="4"/>
@@ -7363,6 +7478,38 @@
                 <w:szCs w:val="20"/>
               </w:rPr>
               <w:t xml:space="preserve">Wajib disertai alasan; data tidak dihapus</w:t>
+            </w:r>
+          </w:p>
+        </w:tc>
+        <w:tc>
+          <w:tcPr>
+            <w:tcW w:type="dxa" w:w="2285"/>
+            <w:tcBorders>
+              <w:top w:val="single" w:color="000000" w:sz="4"/>
+              <w:left w:val="single" w:color="000000" w:sz="4"/>
+              <w:bottom w:val="single" w:color="000000" w:sz="4"/>
+              <w:right w:val="single" w:color="000000" w:sz="4"/>
+            </w:tcBorders>
+            <w:tcMar>
+              <w:top w:type="dxa" w:w="40"/>
+              <w:left w:type="dxa" w:w="90"/>
+              <w:bottom w:type="dxa" w:w="40"/>
+              <w:right w:type="dxa" w:w="90"/>
+            </w:tcMar>
+            <w:vAlign w:val="top"/>
+          </w:tcPr>
+          <w:p>
+            <w:pPr>
+              <w:spacing w:after="0" w:line="240" w:lineRule="auto"/>
+              <w:jc w:val="left"/>
+            </w:pPr>
+            <w:r>
+              <w:rPr>
+                <w:rFonts w:ascii="Arial" w:cs="Arial" w:eastAsia="Arial" w:hAnsi="Arial"/>
+                <w:sz w:val="20"/>
+                <w:szCs w:val="20"/>
+              </w:rPr>
+              <w:t xml:space="preserve">Pasal 52 huruf c, d</w:t>
             </w:r>
           </w:p>
         </w:tc>
@@ -7374,7 +7521,7 @@
         </w:trPr>
         <w:tc>
           <w:tcPr>
-            <w:tcW w:type="dxa" w:w="615"/>
+            <w:tcW w:type="dxa" w:w="527"/>
             <w:tcBorders>
               <w:top w:val="single" w:color="000000" w:sz="4"/>
               <w:left w:val="single" w:color="000000" w:sz="4"/>
@@ -7406,7 +7553,7 @@
         </w:tc>
         <w:tc>
           <w:tcPr>
-            <w:tcW w:type="dxa" w:w="2460"/>
+            <w:tcW w:type="dxa" w:w="1933"/>
             <w:tcBorders>
               <w:top w:val="single" w:color="000000" w:sz="4"/>
               <w:left w:val="single" w:color="000000" w:sz="4"/>
@@ -7438,7 +7585,7 @@
         </w:tc>
         <w:tc>
           <w:tcPr>
-            <w:tcW w:type="dxa" w:w="5712"/>
+            <w:tcW w:type="dxa" w:w="4042"/>
             <w:tcBorders>
               <w:top w:val="single" w:color="000000" w:sz="4"/>
               <w:left w:val="single" w:color="000000" w:sz="4"/>
@@ -7465,6 +7612,38 @@
                 <w:szCs w:val="20"/>
               </w:rPr>
               <w:t xml:space="preserve">Pemberitahuan hanya kepada petugas yang penugasannya berubah</w:t>
+            </w:r>
+          </w:p>
+        </w:tc>
+        <w:tc>
+          <w:tcPr>
+            <w:tcW w:type="dxa" w:w="2285"/>
+            <w:tcBorders>
+              <w:top w:val="single" w:color="000000" w:sz="4"/>
+              <w:left w:val="single" w:color="000000" w:sz="4"/>
+              <w:bottom w:val="single" w:color="000000" w:sz="4"/>
+              <w:right w:val="single" w:color="000000" w:sz="4"/>
+            </w:tcBorders>
+            <w:tcMar>
+              <w:top w:type="dxa" w:w="40"/>
+              <w:left w:type="dxa" w:w="90"/>
+              <w:bottom w:type="dxa" w:w="40"/>
+              <w:right w:type="dxa" w:w="90"/>
+            </w:tcMar>
+            <w:vAlign w:val="top"/>
+          </w:tcPr>
+          <w:p>
+            <w:pPr>
+              <w:spacing w:after="0" w:line="240" w:lineRule="auto"/>
+              <w:jc w:val="left"/>
+            </w:pPr>
+            <w:r>
+              <w:rPr>
+                <w:rFonts w:ascii="Arial" w:cs="Arial" w:eastAsia="Arial" w:hAnsi="Arial"/>
+                <w:sz w:val="20"/>
+                <w:szCs w:val="20"/>
+              </w:rPr>
+              <w:t xml:space="preserve">Pasal 52 huruf e; Pasal 54 huruf h</w:t>
             </w:r>
           </w:p>
         </w:tc>
@@ -7476,7 +7655,7 @@
         </w:trPr>
         <w:tc>
           <w:tcPr>
-            <w:tcW w:type="dxa" w:w="615"/>
+            <w:tcW w:type="dxa" w:w="527"/>
             <w:tcBorders>
               <w:top w:val="single" w:color="000000" w:sz="4"/>
               <w:left w:val="single" w:color="000000" w:sz="4"/>
@@ -7508,7 +7687,7 @@
         </w:tc>
         <w:tc>
           <w:tcPr>
-            <w:tcW w:type="dxa" w:w="2460"/>
+            <w:tcW w:type="dxa" w:w="1933"/>
             <w:tcBorders>
               <w:top w:val="single" w:color="000000" w:sz="4"/>
               <w:left w:val="single" w:color="000000" w:sz="4"/>
@@ -7540,7 +7719,7 @@
         </w:tc>
         <w:tc>
           <w:tcPr>
-            <w:tcW w:type="dxa" w:w="5712"/>
+            <w:tcW w:type="dxa" w:w="4042"/>
             <w:tcBorders>
               <w:top w:val="single" w:color="000000" w:sz="4"/>
               <w:left w:val="single" w:color="000000" w:sz="4"/>
@@ -7567,6 +7746,38 @@
                 <w:szCs w:val="20"/>
               </w:rPr>
               <w:t xml:space="preserve">Permohonan daring berjenjang; otomatis menjadi agenda bila disetujui</w:t>
+            </w:r>
+          </w:p>
+        </w:tc>
+        <w:tc>
+          <w:tcPr>
+            <w:tcW w:type="dxa" w:w="2285"/>
+            <w:tcBorders>
+              <w:top w:val="single" w:color="000000" w:sz="4"/>
+              <w:left w:val="single" w:color="000000" w:sz="4"/>
+              <w:bottom w:val="single" w:color="000000" w:sz="4"/>
+              <w:right w:val="single" w:color="000000" w:sz="4"/>
+            </w:tcBorders>
+            <w:tcMar>
+              <w:top w:type="dxa" w:w="40"/>
+              <w:left w:type="dxa" w:w="90"/>
+              <w:bottom w:type="dxa" w:w="40"/>
+              <w:right w:type="dxa" w:w="90"/>
+            </w:tcMar>
+            <w:vAlign w:val="top"/>
+          </w:tcPr>
+          <w:p>
+            <w:pPr>
+              <w:spacing w:after="0" w:line="240" w:lineRule="auto"/>
+              <w:jc w:val="left"/>
+            </w:pPr>
+            <w:r>
+              <w:rPr>
+                <w:rFonts w:ascii="Arial" w:cs="Arial" w:eastAsia="Arial" w:hAnsi="Arial"/>
+                <w:sz w:val="20"/>
+                <w:szCs w:val="20"/>
+              </w:rPr>
+              <w:t xml:space="preserve">Pasal 52 huruf a, e</w:t>
             </w:r>
           </w:p>
         </w:tc>
@@ -7578,7 +7789,7 @@
         </w:trPr>
         <w:tc>
           <w:tcPr>
-            <w:tcW w:type="dxa" w:w="615"/>
+            <w:tcW w:type="dxa" w:w="527"/>
             <w:tcBorders>
               <w:top w:val="single" w:color="000000" w:sz="4"/>
               <w:left w:val="single" w:color="000000" w:sz="4"/>
@@ -7610,7 +7821,7 @@
         </w:tc>
         <w:tc>
           <w:tcPr>
-            <w:tcW w:type="dxa" w:w="2460"/>
+            <w:tcW w:type="dxa" w:w="1933"/>
             <w:tcBorders>
               <w:top w:val="single" w:color="000000" w:sz="4"/>
               <w:left w:val="single" w:color="000000" w:sz="4"/>
@@ -7642,7 +7853,7 @@
         </w:tc>
         <w:tc>
           <w:tcPr>
-            <w:tcW w:type="dxa" w:w="5712"/>
+            <w:tcW w:type="dxa" w:w="4042"/>
             <w:tcBorders>
               <w:top w:val="single" w:color="000000" w:sz="4"/>
               <w:left w:val="single" w:color="000000" w:sz="4"/>
@@ -7669,6 +7880,38 @@
                 <w:szCs w:val="20"/>
               </w:rPr>
               <w:t xml:space="preserve">Kanal publik dengan kalender ketersediaan dan kode penelusuran</w:t>
+            </w:r>
+          </w:p>
+        </w:tc>
+        <w:tc>
+          <w:tcPr>
+            <w:tcW w:type="dxa" w:w="2285"/>
+            <w:tcBorders>
+              <w:top w:val="single" w:color="000000" w:sz="4"/>
+              <w:left w:val="single" w:color="000000" w:sz="4"/>
+              <w:bottom w:val="single" w:color="000000" w:sz="4"/>
+              <w:right w:val="single" w:color="000000" w:sz="4"/>
+            </w:tcBorders>
+            <w:tcMar>
+              <w:top w:type="dxa" w:w="40"/>
+              <w:left w:type="dxa" w:w="90"/>
+              <w:bottom w:type="dxa" w:w="40"/>
+              <w:right w:type="dxa" w:w="90"/>
+            </w:tcMar>
+            <w:vAlign w:val="top"/>
+          </w:tcPr>
+          <w:p>
+            <w:pPr>
+              <w:spacing w:after="0" w:line="240" w:lineRule="auto"/>
+              <w:jc w:val="left"/>
+            </w:pPr>
+            <w:r>
+              <w:rPr>
+                <w:rFonts w:ascii="Arial" w:cs="Arial" w:eastAsia="Arial" w:hAnsi="Arial"/>
+                <w:sz w:val="20"/>
+                <w:szCs w:val="20"/>
+              </w:rPr>
+              <w:t xml:space="preserve">Pasal 52 huruf b</w:t>
             </w:r>
           </w:p>
         </w:tc>
@@ -7680,7 +7923,7 @@
         </w:trPr>
         <w:tc>
           <w:tcPr>
-            <w:tcW w:type="dxa" w:w="615"/>
+            <w:tcW w:type="dxa" w:w="527"/>
             <w:tcBorders>
               <w:top w:val="single" w:color="000000" w:sz="4"/>
               <w:left w:val="single" w:color="000000" w:sz="4"/>
@@ -7712,7 +7955,7 @@
         </w:tc>
         <w:tc>
           <w:tcPr>
-            <w:tcW w:type="dxa" w:w="2460"/>
+            <w:tcW w:type="dxa" w:w="1933"/>
             <w:tcBorders>
               <w:top w:val="single" w:color="000000" w:sz="4"/>
               <w:left w:val="single" w:color="000000" w:sz="4"/>
@@ -7744,7 +7987,7 @@
         </w:tc>
         <w:tc>
           <w:tcPr>
-            <w:tcW w:type="dxa" w:w="5712"/>
+            <w:tcW w:type="dxa" w:w="4042"/>
             <w:tcBorders>
               <w:top w:val="single" w:color="000000" w:sz="4"/>
               <w:left w:val="single" w:color="000000" w:sz="4"/>
@@ -7771,6 +8014,38 @@
                 <w:szCs w:val="20"/>
               </w:rPr>
               <w:t xml:space="preserve">Pindai kode QR; tanda tangan layar sentuh; buka-tutup mengikuti jam acara</w:t>
+            </w:r>
+          </w:p>
+        </w:tc>
+        <w:tc>
+          <w:tcPr>
+            <w:tcW w:type="dxa" w:w="2285"/>
+            <w:tcBorders>
+              <w:top w:val="single" w:color="000000" w:sz="4"/>
+              <w:left w:val="single" w:color="000000" w:sz="4"/>
+              <w:bottom w:val="single" w:color="000000" w:sz="4"/>
+              <w:right w:val="single" w:color="000000" w:sz="4"/>
+            </w:tcBorders>
+            <w:tcMar>
+              <w:top w:type="dxa" w:w="40"/>
+              <w:left w:type="dxa" w:w="90"/>
+              <w:bottom w:type="dxa" w:w="40"/>
+              <w:right w:type="dxa" w:w="90"/>
+            </w:tcMar>
+            <w:vAlign w:val="top"/>
+          </w:tcPr>
+          <w:p>
+            <w:pPr>
+              <w:spacing w:after="0" w:line="240" w:lineRule="auto"/>
+              <w:jc w:val="left"/>
+            </w:pPr>
+            <w:r>
+              <w:rPr>
+                <w:rFonts w:ascii="Arial" w:cs="Arial" w:eastAsia="Arial" w:hAnsi="Arial"/>
+                <w:sz w:val="20"/>
+                <w:szCs w:val="20"/>
+              </w:rPr>
+              <w:t xml:space="preserve">Pasal 52 huruf e</w:t>
             </w:r>
           </w:p>
         </w:tc>
@@ -7782,7 +8057,7 @@
         </w:trPr>
         <w:tc>
           <w:tcPr>
-            <w:tcW w:type="dxa" w:w="615"/>
+            <w:tcW w:type="dxa" w:w="527"/>
             <w:tcBorders>
               <w:top w:val="single" w:color="000000" w:sz="4"/>
               <w:left w:val="single" w:color="000000" w:sz="4"/>
@@ -7814,7 +8089,7 @@
         </w:tc>
         <w:tc>
           <w:tcPr>
-            <w:tcW w:type="dxa" w:w="2460"/>
+            <w:tcW w:type="dxa" w:w="1933"/>
             <w:tcBorders>
               <w:top w:val="single" w:color="000000" w:sz="4"/>
               <w:left w:val="single" w:color="000000" w:sz="4"/>
@@ -7846,7 +8121,7 @@
         </w:tc>
         <w:tc>
           <w:tcPr>
-            <w:tcW w:type="dxa" w:w="5712"/>
+            <w:tcW w:type="dxa" w:w="4042"/>
             <w:tcBorders>
               <w:top w:val="single" w:color="000000" w:sz="4"/>
               <w:left w:val="single" w:color="000000" w:sz="4"/>
@@ -7873,6 +8148,38 @@
                 <w:szCs w:val="20"/>
               </w:rPr>
               <w:t xml:space="preserve">Penyusun, penyelia, dan pengesah dalam satu alur</w:t>
+            </w:r>
+          </w:p>
+        </w:tc>
+        <w:tc>
+          <w:tcPr>
+            <w:tcW w:type="dxa" w:w="2285"/>
+            <w:tcBorders>
+              <w:top w:val="single" w:color="000000" w:sz="4"/>
+              <w:left w:val="single" w:color="000000" w:sz="4"/>
+              <w:bottom w:val="single" w:color="000000" w:sz="4"/>
+              <w:right w:val="single" w:color="000000" w:sz="4"/>
+            </w:tcBorders>
+            <w:tcMar>
+              <w:top w:type="dxa" w:w="40"/>
+              <w:left w:type="dxa" w:w="90"/>
+              <w:bottom w:type="dxa" w:w="40"/>
+              <w:right w:type="dxa" w:w="90"/>
+            </w:tcMar>
+            <w:vAlign w:val="top"/>
+          </w:tcPr>
+          <w:p>
+            <w:pPr>
+              <w:spacing w:after="0" w:line="240" w:lineRule="auto"/>
+              <w:jc w:val="left"/>
+            </w:pPr>
+            <w:r>
+              <w:rPr>
+                <w:rFonts w:ascii="Arial" w:cs="Arial" w:eastAsia="Arial" w:hAnsi="Arial"/>
+                <w:sz w:val="20"/>
+                <w:szCs w:val="20"/>
+              </w:rPr>
+              <w:t xml:space="preserve">Pasal 54 huruf g</w:t>
             </w:r>
           </w:p>
         </w:tc>
@@ -7884,7 +8191,7 @@
         </w:trPr>
         <w:tc>
           <w:tcPr>
-            <w:tcW w:type="dxa" w:w="615"/>
+            <w:tcW w:type="dxa" w:w="527"/>
             <w:tcBorders>
               <w:top w:val="single" w:color="000000" w:sz="4"/>
               <w:left w:val="single" w:color="000000" w:sz="4"/>
@@ -7916,7 +8223,7 @@
         </w:tc>
         <w:tc>
           <w:tcPr>
-            <w:tcW w:type="dxa" w:w="2460"/>
+            <w:tcW w:type="dxa" w:w="1933"/>
             <w:tcBorders>
               <w:top w:val="single" w:color="000000" w:sz="4"/>
               <w:left w:val="single" w:color="000000" w:sz="4"/>
@@ -7948,7 +8255,7 @@
         </w:tc>
         <w:tc>
           <w:tcPr>
-            <w:tcW w:type="dxa" w:w="5712"/>
+            <w:tcW w:type="dxa" w:w="4042"/>
             <w:tcBorders>
               <w:top w:val="single" w:color="000000" w:sz="4"/>
               <w:left w:val="single" w:color="000000" w:sz="4"/>
@@ -7975,6 +8282,38 @@
                 <w:szCs w:val="20"/>
               </w:rPr>
               <w:t xml:space="preserve">Rancangan naskah berita berbantuan kecerdasan buatan, wajib disunting petugas</w:t>
+            </w:r>
+          </w:p>
+        </w:tc>
+        <w:tc>
+          <w:tcPr>
+            <w:tcW w:type="dxa" w:w="2285"/>
+            <w:tcBorders>
+              <w:top w:val="single" w:color="000000" w:sz="4"/>
+              <w:left w:val="single" w:color="000000" w:sz="4"/>
+              <w:bottom w:val="single" w:color="000000" w:sz="4"/>
+              <w:right w:val="single" w:color="000000" w:sz="4"/>
+            </w:tcBorders>
+            <w:tcMar>
+              <w:top w:type="dxa" w:w="40"/>
+              <w:left w:type="dxa" w:w="90"/>
+              <w:bottom w:type="dxa" w:w="40"/>
+              <w:right w:type="dxa" w:w="90"/>
+            </w:tcMar>
+            <w:vAlign w:val="top"/>
+          </w:tcPr>
+          <w:p>
+            <w:pPr>
+              <w:spacing w:after="0" w:line="240" w:lineRule="auto"/>
+              <w:jc w:val="left"/>
+            </w:pPr>
+            <w:r>
+              <w:rPr>
+                <w:rFonts w:ascii="Arial" w:cs="Arial" w:eastAsia="Arial" w:hAnsi="Arial"/>
+                <w:sz w:val="20"/>
+                <w:szCs w:val="20"/>
+              </w:rPr>
+              <w:t xml:space="preserve">Pasal 54 huruf h, j</w:t>
             </w:r>
           </w:p>
         </w:tc>
@@ -7986,7 +8325,7 @@
         </w:trPr>
         <w:tc>
           <w:tcPr>
-            <w:tcW w:type="dxa" w:w="615"/>
+            <w:tcW w:type="dxa" w:w="527"/>
             <w:tcBorders>
               <w:top w:val="single" w:color="000000" w:sz="4"/>
               <w:left w:val="single" w:color="000000" w:sz="4"/>
@@ -8018,7 +8357,7 @@
         </w:tc>
         <w:tc>
           <w:tcPr>
-            <w:tcW w:type="dxa" w:w="2460"/>
+            <w:tcW w:type="dxa" w:w="1933"/>
             <w:tcBorders>
               <w:top w:val="single" w:color="000000" w:sz="4"/>
               <w:left w:val="single" w:color="000000" w:sz="4"/>
@@ -8050,7 +8389,7 @@
         </w:tc>
         <w:tc>
           <w:tcPr>
-            <w:tcW w:type="dxa" w:w="5712"/>
+            <w:tcW w:type="dxa" w:w="4042"/>
             <w:tcBorders>
               <w:top w:val="single" w:color="000000" w:sz="4"/>
               <w:left w:val="single" w:color="000000" w:sz="4"/>
@@ -8077,6 +8416,38 @@
                 <w:szCs w:val="20"/>
               </w:rPr>
               <w:t xml:space="preserve">Tata letak baku; penomoran tetap melalui aplikasi persuratan</w:t>
+            </w:r>
+          </w:p>
+        </w:tc>
+        <w:tc>
+          <w:tcPr>
+            <w:tcW w:type="dxa" w:w="2285"/>
+            <w:tcBorders>
+              <w:top w:val="single" w:color="000000" w:sz="4"/>
+              <w:left w:val="single" w:color="000000" w:sz="4"/>
+              <w:bottom w:val="single" w:color="000000" w:sz="4"/>
+              <w:right w:val="single" w:color="000000" w:sz="4"/>
+            </w:tcBorders>
+            <w:tcMar>
+              <w:top w:type="dxa" w:w="40"/>
+              <w:left w:type="dxa" w:w="90"/>
+              <w:bottom w:type="dxa" w:w="40"/>
+              <w:right w:type="dxa" w:w="90"/>
+            </w:tcMar>
+            <w:vAlign w:val="top"/>
+          </w:tcPr>
+          <w:p>
+            <w:pPr>
+              <w:spacing w:after="0" w:line="240" w:lineRule="auto"/>
+              <w:jc w:val="left"/>
+            </w:pPr>
+            <w:r>
+              <w:rPr>
+                <w:rFonts w:ascii="Arial" w:cs="Arial" w:eastAsia="Arial" w:hAnsi="Arial"/>
+                <w:sz w:val="20"/>
+                <w:szCs w:val="20"/>
+              </w:rPr>
+              <w:t xml:space="preserve">Pasal 52 huruf f</w:t>
             </w:r>
           </w:p>
         </w:tc>
@@ -8088,7 +8459,7 @@
         </w:trPr>
         <w:tc>
           <w:tcPr>
-            <w:tcW w:type="dxa" w:w="615"/>
+            <w:tcW w:type="dxa" w:w="527"/>
             <w:tcBorders>
               <w:top w:val="single" w:color="000000" w:sz="4"/>
               <w:left w:val="single" w:color="000000" w:sz="4"/>
@@ -8120,7 +8491,7 @@
         </w:tc>
         <w:tc>
           <w:tcPr>
-            <w:tcW w:type="dxa" w:w="2460"/>
+            <w:tcW w:type="dxa" w:w="1933"/>
             <w:tcBorders>
               <w:top w:val="single" w:color="000000" w:sz="4"/>
               <w:left w:val="single" w:color="000000" w:sz="4"/>
@@ -8152,7 +8523,7 @@
         </w:tc>
         <w:tc>
           <w:tcPr>
-            <w:tcW w:type="dxa" w:w="5712"/>
+            <w:tcW w:type="dxa" w:w="4042"/>
             <w:tcBorders>
               <w:top w:val="single" w:color="000000" w:sz="4"/>
               <w:left w:val="single" w:color="000000" w:sz="4"/>
@@ -8179,6 +8550,38 @@
                 <w:szCs w:val="20"/>
               </w:rPr>
               <w:t xml:space="preserve">Butir penilaian berbeda untuk petugas protokol dan dokumentasi</w:t>
+            </w:r>
+          </w:p>
+        </w:tc>
+        <w:tc>
+          <w:tcPr>
+            <w:tcW w:type="dxa" w:w="2285"/>
+            <w:tcBorders>
+              <w:top w:val="single" w:color="000000" w:sz="4"/>
+              <w:left w:val="single" w:color="000000" w:sz="4"/>
+              <w:bottom w:val="single" w:color="000000" w:sz="4"/>
+              <w:right w:val="single" w:color="000000" w:sz="4"/>
+            </w:tcBorders>
+            <w:tcMar>
+              <w:top w:type="dxa" w:w="40"/>
+              <w:left w:type="dxa" w:w="90"/>
+              <w:bottom w:type="dxa" w:w="40"/>
+              <w:right w:type="dxa" w:w="90"/>
+            </w:tcMar>
+            <w:vAlign w:val="top"/>
+          </w:tcPr>
+          <w:p>
+            <w:pPr>
+              <w:spacing w:after="0" w:line="240" w:lineRule="auto"/>
+              <w:jc w:val="left"/>
+            </w:pPr>
+            <w:r>
+              <w:rPr>
+                <w:rFonts w:ascii="Arial" w:cs="Arial" w:eastAsia="Arial" w:hAnsi="Arial"/>
+                <w:sz w:val="20"/>
+                <w:szCs w:val="20"/>
+              </w:rPr>
+              <w:t xml:space="preserve">Pasal 50 huruf c</w:t>
             </w:r>
           </w:p>
         </w:tc>
@@ -8186,8 +8589,19 @@
     </w:tbl>
     <w:p>
       <w:pPr>
-        <w:spacing w:after="100"/>
-      </w:pPr>
+        <w:spacing w:after="140" w:before="40" w:line="250" w:lineRule="auto"/>
+        <w:jc w:val="both"/>
+      </w:pPr>
+      <w:r>
+        <w:rPr>
+          <w:rFonts w:ascii="Arial" w:cs="Arial" w:eastAsia="Arial" w:hAnsi="Arial"/>
+          <w:i/>
+          <w:iCs/>
+          <w:sz w:val="18"/>
+          <w:szCs w:val="18"/>
+        </w:rPr>
+        <w:t xml:space="preserve">Dasar tugas: Peraturan Wali Kota Tarakan Nomor 50 Tahun 2021.</w:t>
+      </w:r>
     </w:p>
     <w:p>
       <w:pPr>
@@ -8330,7 +8744,7 @@
           <w:sz w:val="22"/>
           <w:szCs w:val="22"/>
         </w:rPr>
-        <w:t xml:space="preserve"> Usulan perubahan jadwal yang tertahan ditandai menurut umur usulan dan kedekatan hari pelaksanaan, sehingga usulan untuk acara esok hari langsung menonjol. Kepala Bagian dapat memantau usulan yang masih di tingkat Kepala Subbagian tanpa melangkahi jenjang.</w:t>
+        <w:t xml:space="preserve"> Usulan perubahan jadwal yang tertahan ditandai menurut umur usulan dan kedekatan hari pelaksanaan, sehingga usulan untuk acara esok hari langsung menonjol. Kepala Bagian dapat memantau usulan yang masih di tingkat Kepala Sub Bagian tanpa melangkahi jenjang.</w:t>
       </w:r>
     </w:p>
     <w:p>
@@ -8388,7 +8802,7 @@
           <w:sz w:val="22"/>
           <w:szCs w:val="22"/>
         </w:rPr>
-        <w:t xml:space="preserve"> Kegiatan yang telah disetujui tampil dengan sendirinya di Google Calendar bersama yang dapat dilanggani pihak terkait tanpa perlu akun aplikasi. Perubahan dan pembatalan ikut menyesuaikan dalam hitungan detik. Yang dikirim hanya informasi yang layak dilihat pelanggan kalender; nomor narahubung dan catatan internal tidak ikut, dan Kepala Bagian serta Kepala Subbagian Komunikasi dan Dokumentasi Pimpinan dapat menahan kegiatan tertentu agar tidak ditampilkan.</w:t>
+        <w:t xml:space="preserve"> Kegiatan yang telah disetujui tampil dengan sendirinya di Google Calendar bersama yang dapat dilanggani pihak terkait tanpa perlu akun aplikasi. Perubahan dan pembatalan ikut menyesuaikan dalam hitungan detik. Yang dikirim hanya informasi yang layak dilihat pelanggan kalender; nomor narahubung dan catatan internal tidak ikut, dan Kepala Bagian serta Kepala Sub Bagian Komunikasi dan Dokumentasi Pimpinan dapat menahan kegiatan tertentu agar tidak ditampilkan.</w:t>
       </w:r>
     </w:p>
     <w:p>
@@ -13426,7 +13840,7 @@
                 <w:sz w:val="20"/>
                 <w:szCs w:val="20"/>
               </w:rPr>
-              <w:t xml:space="preserve">    menunggu penelaahan Kepala Subbagian</w:t>
+              <w:t xml:space="preserve">    menunggu penelaahan Kepala Sub Bagian</w:t>
             </w:r>
           </w:p>
         </w:tc>
@@ -19804,7 +20218,7 @@
                 <w:sz w:val="22"/>
                 <w:szCs w:val="22"/>
               </w:rPr>
-              <w:t xml:space="preserve">19881103 200701 1 003</w:t>
+              <w:t xml:space="preserve">198811032007011003</w:t>
             </w:r>
           </w:p>
         </w:tc>
@@ -20425,7 +20839,7 @@
                 <w:sz w:val="22"/>
                 <w:szCs w:val="22"/>
               </w:rPr>
-              <w:t xml:space="preserve">NIP 19881103 200701 1 003</w:t>
+              <w:t xml:space="preserve">NIP 198811032007011003</w:t>
             </w:r>
           </w:p>
         </w:tc>
@@ -21630,7 +22044,7 @@
                 <w:sz w:val="22"/>
                 <w:szCs w:val="22"/>
               </w:rPr>
-              <w:t xml:space="preserve">Saifullah, S.H.; Juliyanti, S.AP.; Nuraini Wiliadewi, S.IP.; Ni Kade Sari Handayani, S.AP.</w:t>
+              <w:t xml:space="preserve">Saifullah, S.H.; Juliyanti, S.AP.; Mastura, S.Sos.; Ni Kade Sari Handayani, S.AP.</w:t>
             </w:r>
           </w:p>
         </w:tc>
@@ -21930,7 +22344,7 @@
           <w:highlight w:val="yellow"/>
           <w:highlightCs w:val="yellow"/>
         </w:rPr>
-        <w:t xml:space="preserve">Menyusul: pindaian KTP atau kartu pegawai kelima anggota tim</w:t>
+        <w:t xml:space="preserve">Pindaian Kartu Tanda Penduduk kelima anggota tim</w:t>
       </w:r>
     </w:p>
     <w:p>
@@ -22153,7 +22567,7 @@
           <w:sz w:val="20"/>
           <w:szCs w:val="20"/>
         </w:rPr>
-        <w:t xml:space="preserve">Gambar L.3. Jadwal tayang pada dasbor Kepala Subbagian, dengan peringatan kegiatan yang belum berpetugas</w:t>
+        <w:t xml:space="preserve">Gambar L.3. Jadwal tayang pada dasbor Kepala Sub Bagian, dengan peringatan kegiatan yang belum berpetugas</w:t>
       </w:r>
     </w:p>
     <w:tbl>
@@ -22809,7 +23223,7 @@
                 <w:sz w:val="18"/>
                 <w:szCs w:val="18"/>
               </w:rPr>
-              <w:t xml:space="preserve">Diteruskan Kepala Subbagian</w:t>
+              <w:t xml:space="preserve">Diteruskan Kepala Sub Bagian</w:t>
             </w:r>
           </w:p>
         </w:tc>
@@ -24283,7 +24697,7 @@
                 <w:sz w:val="18"/>
                 <w:szCs w:val="18"/>
               </w:rPr>
-              <w:t xml:space="preserve">Dikembalikan Kepala Subbagian</w:t>
+              <w:t xml:space="preserve">Dikembalikan Kepala Sub Bagian</w:t>
             </w:r>
           </w:p>
         </w:tc>
@@ -25467,7 +25881,7 @@
                 <w:sz w:val="18"/>
                 <w:szCs w:val="18"/>
               </w:rPr>
-              <w:t xml:space="preserve">Kepala Subbagian Komunikasi dan Dokumentasi</w:t>
+              <w:t xml:space="preserve">Kepala Sub Bagian Komunikasi dan Dokumentasi Pimpinan</w:t>
             </w:r>
           </w:p>
         </w:tc>
@@ -25531,7 +25945,7 @@
                 <w:sz w:val="18"/>
                 <w:szCs w:val="18"/>
               </w:rPr>
-              <w:t xml:space="preserve">Kepala Subbagian Protokol</w:t>
+              <w:t xml:space="preserve">Kepala Sub Bagian Protokol</w:t>
             </w:r>
           </w:p>
         </w:tc>

</xml_diff>